<commit_message>
implement Fizz Buzz logic and add user input for range;
</commit_message>
<xml_diff>
--- a/Notes/DSA Notes.docx
+++ b/Notes/DSA Notes.docx
@@ -1158,13 +1158,8 @@
             <w:hideMark/>
           </w:tcPr>
           <w:p>
-            <w:proofErr w:type="gramStart"/>
-            <w:r>
-              <w:t>a !</w:t>
-            </w:r>
-            <w:proofErr w:type="gramEnd"/>
-            <w:r>
-              <w:t>= b</w:t>
+            <w:r>
+              <w:t>a != b</w:t>
             </w:r>
           </w:p>
         </w:tc>
@@ -1591,13 +1586,8 @@
             <w:r>
               <w:t xml:space="preserve">     </w:t>
             </w:r>
-            <w:proofErr w:type="gramStart"/>
-            <w:r>
-              <w:t>!(</w:t>
-            </w:r>
-            <w:proofErr w:type="gramEnd"/>
-            <w:r>
-              <w:t>a &gt; b)</w:t>
+            <w:r>
+              <w:t>!(a &gt; b)</w:t>
             </w:r>
           </w:p>
         </w:tc>
@@ -2287,11 +2277,9 @@
             <w:hideMark/>
           </w:tcPr>
           <w:p>
-            <w:proofErr w:type="gramStart"/>
             <w:r>
               <w:t>!true</w:t>
             </w:r>
-            <w:proofErr w:type="gramEnd"/>
           </w:p>
         </w:tc>
       </w:tr>
@@ -2857,23 +2845,7 @@
           </w:tcPr>
           <w:p>
             <w:r>
-              <w:t xml:space="preserve">a &gt; </w:t>
-            </w:r>
-            <w:proofErr w:type="gramStart"/>
-            <w:r>
-              <w:t>b ?</w:t>
-            </w:r>
-            <w:proofErr w:type="gramEnd"/>
-            <w:r>
-              <w:t xml:space="preserve"> </w:t>
-            </w:r>
-            <w:proofErr w:type="gramStart"/>
-            <w:r>
-              <w:t>a :</w:t>
-            </w:r>
-            <w:proofErr w:type="gramEnd"/>
-            <w:r>
-              <w:t xml:space="preserve"> b</w:t>
+              <w:t>a &gt; b ? a : b</w:t>
             </w:r>
           </w:p>
         </w:tc>
@@ -3071,6 +3043,88 @@
       </w:tr>
     </w:tbl>
     <w:p/>
+    <w:p>
+      <w:r>
+        <w:rPr>
+          <w:noProof/>
+        </w:rPr>
+        <w:drawing>
+          <wp:inline distT="0" distB="0" distL="0" distR="0" wp14:anchorId="7C2C9800" wp14:editId="18F956CE">
+            <wp:extent cx="3311952" cy="4137660"/>
+            <wp:effectExtent l="0" t="0" r="3175" b="0"/>
+            <wp:docPr id="325824169" name="Picture 1"/>
+            <wp:cNvGraphicFramePr>
+              <a:graphicFrameLocks xmlns:a="http://schemas.openxmlformats.org/drawingml/2006/main" noChangeAspect="1"/>
+            </wp:cNvGraphicFramePr>
+            <a:graphic xmlns:a="http://schemas.openxmlformats.org/drawingml/2006/main">
+              <a:graphicData uri="http://schemas.openxmlformats.org/drawingml/2006/picture">
+                <pic:pic xmlns:pic="http://schemas.openxmlformats.org/drawingml/2006/picture">
+                  <pic:nvPicPr>
+                    <pic:cNvPr id="325824169" name=""/>
+                    <pic:cNvPicPr/>
+                  </pic:nvPicPr>
+                  <pic:blipFill>
+                    <a:blip r:embed="rId7"/>
+                    <a:stretch>
+                      <a:fillRect/>
+                    </a:stretch>
+                  </pic:blipFill>
+                  <pic:spPr>
+                    <a:xfrm>
+                      <a:off x="0" y="0"/>
+                      <a:ext cx="3324273" cy="4153052"/>
+                    </a:xfrm>
+                    <a:prstGeom prst="rect">
+                      <a:avLst/>
+                    </a:prstGeom>
+                  </pic:spPr>
+                </pic:pic>
+              </a:graphicData>
+            </a:graphic>
+          </wp:inline>
+        </w:drawing>
+      </w:r>
+    </w:p>
+    <w:p>
+      <w:r>
+        <w:lastRenderedPageBreak/>
+        <w:drawing>
+          <wp:inline distT="0" distB="0" distL="0" distR="0" wp14:anchorId="47D797C7" wp14:editId="3B4A8EEA">
+            <wp:extent cx="3434061" cy="4930140"/>
+            <wp:effectExtent l="0" t="0" r="0" b="3810"/>
+            <wp:docPr id="1136314750" name="Picture 1"/>
+            <wp:cNvGraphicFramePr>
+              <a:graphicFrameLocks xmlns:a="http://schemas.openxmlformats.org/drawingml/2006/main" noChangeAspect="1"/>
+            </wp:cNvGraphicFramePr>
+            <a:graphic xmlns:a="http://schemas.openxmlformats.org/drawingml/2006/main">
+              <a:graphicData uri="http://schemas.openxmlformats.org/drawingml/2006/picture">
+                <pic:pic xmlns:pic="http://schemas.openxmlformats.org/drawingml/2006/picture">
+                  <pic:nvPicPr>
+                    <pic:cNvPr id="1136314750" name=""/>
+                    <pic:cNvPicPr/>
+                  </pic:nvPicPr>
+                  <pic:blipFill>
+                    <a:blip r:embed="rId8"/>
+                    <a:stretch>
+                      <a:fillRect/>
+                    </a:stretch>
+                  </pic:blipFill>
+                  <pic:spPr>
+                    <a:xfrm>
+                      <a:off x="0" y="0"/>
+                      <a:ext cx="3441642" cy="4941024"/>
+                    </a:xfrm>
+                    <a:prstGeom prst="rect">
+                      <a:avLst/>
+                    </a:prstGeom>
+                  </pic:spPr>
+                </pic:pic>
+              </a:graphicData>
+            </a:graphic>
+          </wp:inline>
+        </w:drawing>
+      </w:r>
+    </w:p>
     <w:p/>
     <w:sectPr>
       <w:pgSz w:w="11906" w:h="16838"/>
@@ -3972,6 +4026,7 @@
   <w:style w:type="character" w:default="1" w:styleId="DefaultParagraphFont">
     <w:name w:val="Default Paragraph Font"/>
     <w:uiPriority w:val="1"/>
+    <w:semiHidden/>
     <w:unhideWhenUsed/>
   </w:style>
   <w:style w:type="table" w:default="1" w:styleId="TableNormal">

</xml_diff>

<commit_message>
print a pyramid pattern
</commit_message>
<xml_diff>
--- a/Notes/DSA Notes.docx
+++ b/Notes/DSA Notes.docx
@@ -3087,11 +3087,14 @@
     </w:p>
     <w:p>
       <w:r>
+        <w:rPr>
+          <w:noProof/>
+        </w:rPr>
         <w:lastRenderedPageBreak/>
         <w:drawing>
-          <wp:inline distT="0" distB="0" distL="0" distR="0" wp14:anchorId="47D797C7" wp14:editId="3B4A8EEA">
-            <wp:extent cx="3434061" cy="4930140"/>
-            <wp:effectExtent l="0" t="0" r="0" b="3810"/>
+          <wp:inline distT="0" distB="0" distL="0" distR="0" wp14:anchorId="47D797C7" wp14:editId="6B0E6085">
+            <wp:extent cx="3230880" cy="4638442"/>
+            <wp:effectExtent l="0" t="0" r="7620" b="0"/>
             <wp:docPr id="1136314750" name="Picture 1"/>
             <wp:cNvGraphicFramePr>
               <a:graphicFrameLocks xmlns:a="http://schemas.openxmlformats.org/drawingml/2006/main" noChangeAspect="1"/>
@@ -3112,7 +3115,7 @@
                   <pic:spPr>
                     <a:xfrm>
                       <a:off x="0" y="0"/>
-                      <a:ext cx="3441642" cy="4941024"/>
+                      <a:ext cx="3249125" cy="4664636"/>
                     </a:xfrm>
                     <a:prstGeom prst="rect">
                       <a:avLst/>
@@ -3125,6 +3128,46 @@
         </w:drawing>
       </w:r>
     </w:p>
+    <w:p>
+      <w:r>
+        <w:drawing>
+          <wp:inline distT="0" distB="0" distL="0" distR="0" wp14:anchorId="79DB3D17" wp14:editId="770636CD">
+            <wp:extent cx="3390900" cy="4101821"/>
+            <wp:effectExtent l="0" t="0" r="0" b="0"/>
+            <wp:docPr id="1275783427" name="Picture 1"/>
+            <wp:cNvGraphicFramePr>
+              <a:graphicFrameLocks xmlns:a="http://schemas.openxmlformats.org/drawingml/2006/main" noChangeAspect="1"/>
+            </wp:cNvGraphicFramePr>
+            <a:graphic xmlns:a="http://schemas.openxmlformats.org/drawingml/2006/main">
+              <a:graphicData uri="http://schemas.openxmlformats.org/drawingml/2006/picture">
+                <pic:pic xmlns:pic="http://schemas.openxmlformats.org/drawingml/2006/picture">
+                  <pic:nvPicPr>
+                    <pic:cNvPr id="1275783427" name=""/>
+                    <pic:cNvPicPr/>
+                  </pic:nvPicPr>
+                  <pic:blipFill>
+                    <a:blip r:embed="rId9"/>
+                    <a:stretch>
+                      <a:fillRect/>
+                    </a:stretch>
+                  </pic:blipFill>
+                  <pic:spPr>
+                    <a:xfrm>
+                      <a:off x="0" y="0"/>
+                      <a:ext cx="3400914" cy="4113935"/>
+                    </a:xfrm>
+                    <a:prstGeom prst="rect">
+                      <a:avLst/>
+                    </a:prstGeom>
+                  </pic:spPr>
+                </pic:pic>
+              </a:graphicData>
+            </a:graphic>
+          </wp:inline>
+        </w:drawing>
+      </w:r>
+    </w:p>
+    <w:p/>
     <w:p/>
     <w:sectPr>
       <w:pgSz w:w="11906" w:h="16838"/>

</xml_diff>

<commit_message>
print a pyramid pattern using characters instead of numbers. Also, add a change entry for a new document in the workspace settings.
</commit_message>
<xml_diff>
--- a/Notes/DSA Notes.docx
+++ b/Notes/DSA Notes.docx
@@ -3130,6 +3130,9 @@
     </w:p>
     <w:p>
       <w:r>
+        <w:rPr>
+          <w:noProof/>
+        </w:rPr>
         <w:drawing>
           <wp:inline distT="0" distB="0" distL="0" distR="0" wp14:anchorId="79DB3D17" wp14:editId="770636CD">
             <wp:extent cx="3390900" cy="4101821"/>
@@ -3155,6 +3158,86 @@
                     <a:xfrm>
                       <a:off x="0" y="0"/>
                       <a:ext cx="3400914" cy="4113935"/>
+                    </a:xfrm>
+                    <a:prstGeom prst="rect">
+                      <a:avLst/>
+                    </a:prstGeom>
+                  </pic:spPr>
+                </pic:pic>
+              </a:graphicData>
+            </a:graphic>
+          </wp:inline>
+        </w:drawing>
+      </w:r>
+    </w:p>
+    <w:p>
+      <w:r>
+        <w:lastRenderedPageBreak/>
+        <w:drawing>
+          <wp:inline distT="0" distB="0" distL="0" distR="0" wp14:anchorId="0F75AB8F" wp14:editId="15861F66">
+            <wp:extent cx="2781300" cy="1409479"/>
+            <wp:effectExtent l="0" t="0" r="0" b="635"/>
+            <wp:docPr id="921616460" name="Picture 1"/>
+            <wp:cNvGraphicFramePr>
+              <a:graphicFrameLocks xmlns:a="http://schemas.openxmlformats.org/drawingml/2006/main" noChangeAspect="1"/>
+            </wp:cNvGraphicFramePr>
+            <a:graphic xmlns:a="http://schemas.openxmlformats.org/drawingml/2006/main">
+              <a:graphicData uri="http://schemas.openxmlformats.org/drawingml/2006/picture">
+                <pic:pic xmlns:pic="http://schemas.openxmlformats.org/drawingml/2006/picture">
+                  <pic:nvPicPr>
+                    <pic:cNvPr id="921616460" name=""/>
+                    <pic:cNvPicPr/>
+                  </pic:nvPicPr>
+                  <pic:blipFill>
+                    <a:blip r:embed="rId10"/>
+                    <a:stretch>
+                      <a:fillRect/>
+                    </a:stretch>
+                  </pic:blipFill>
+                  <pic:spPr>
+                    <a:xfrm>
+                      <a:off x="0" y="0"/>
+                      <a:ext cx="2794476" cy="1416156"/>
+                    </a:xfrm>
+                    <a:prstGeom prst="rect">
+                      <a:avLst/>
+                    </a:prstGeom>
+                  </pic:spPr>
+                </pic:pic>
+              </a:graphicData>
+            </a:graphic>
+          </wp:inline>
+        </w:drawing>
+      </w:r>
+      <w:r>
+        <w:t xml:space="preserve">   </w:t>
+      </w:r>
+      <w:r>
+        <w:drawing>
+          <wp:inline distT="0" distB="0" distL="0" distR="0" wp14:anchorId="460BFA5F" wp14:editId="55991D17">
+            <wp:extent cx="472481" cy="670618"/>
+            <wp:effectExtent l="0" t="0" r="3810" b="0"/>
+            <wp:docPr id="460465343" name="Picture 1" descr="A number on a black background&#10;&#10;AI-generated content may be incorrect."/>
+            <wp:cNvGraphicFramePr>
+              <a:graphicFrameLocks xmlns:a="http://schemas.openxmlformats.org/drawingml/2006/main" noChangeAspect="1"/>
+            </wp:cNvGraphicFramePr>
+            <a:graphic xmlns:a="http://schemas.openxmlformats.org/drawingml/2006/main">
+              <a:graphicData uri="http://schemas.openxmlformats.org/drawingml/2006/picture">
+                <pic:pic xmlns:pic="http://schemas.openxmlformats.org/drawingml/2006/picture">
+                  <pic:nvPicPr>
+                    <pic:cNvPr id="460465343" name="Picture 1" descr="A number on a black background&#10;&#10;AI-generated content may be incorrect."/>
+                    <pic:cNvPicPr/>
+                  </pic:nvPicPr>
+                  <pic:blipFill>
+                    <a:blip r:embed="rId11"/>
+                    <a:stretch>
+                      <a:fillRect/>
+                    </a:stretch>
+                  </pic:blipFill>
+                  <pic:spPr>
+                    <a:xfrm>
+                      <a:off x="0" y="0"/>
+                      <a:ext cx="472481" cy="670618"/>
                     </a:xfrm>
                     <a:prstGeom prst="rect">
                       <a:avLst/>

</xml_diff>

<commit_message>
Refactor JavaBasics to print a pyramid pattern using asterisks based on user input, and remove unnecessary change entry from workspace settings.
</commit_message>
<xml_diff>
--- a/Notes/DSA Notes.docx
+++ b/Notes/DSA Notes.docx
@@ -3210,7 +3210,19 @@
         </w:drawing>
       </w:r>
       <w:r>
-        <w:t xml:space="preserve">   </w:t>
+        <w:t xml:space="preserve"> </w:t>
+      </w:r>
+      <w:r>
+        <w:t xml:space="preserve"> </w:t>
+      </w:r>
+      <w:r>
+        <w:t xml:space="preserve"> </w:t>
+      </w:r>
+      <w:r>
+        <w:t xml:space="preserve"> </w:t>
+      </w:r>
+      <w:r>
+        <w:t xml:space="preserve"> </w:t>
       </w:r>
       <w:r>
         <w:drawing>
@@ -3250,7 +3262,85 @@
         </w:drawing>
       </w:r>
     </w:p>
-    <w:p/>
+    <w:p>
+      <w:r>
+        <w:drawing>
+          <wp:inline distT="0" distB="0" distL="0" distR="0" wp14:anchorId="5D0A6885" wp14:editId="1348C3AB">
+            <wp:extent cx="2850610" cy="1920240"/>
+            <wp:effectExtent l="0" t="0" r="6985" b="3810"/>
+            <wp:docPr id="637889389" name="Picture 1"/>
+            <wp:cNvGraphicFramePr>
+              <a:graphicFrameLocks xmlns:a="http://schemas.openxmlformats.org/drawingml/2006/main" noChangeAspect="1"/>
+            </wp:cNvGraphicFramePr>
+            <a:graphic xmlns:a="http://schemas.openxmlformats.org/drawingml/2006/main">
+              <a:graphicData uri="http://schemas.openxmlformats.org/drawingml/2006/picture">
+                <pic:pic xmlns:pic="http://schemas.openxmlformats.org/drawingml/2006/picture">
+                  <pic:nvPicPr>
+                    <pic:cNvPr id="637889389" name=""/>
+                    <pic:cNvPicPr/>
+                  </pic:nvPicPr>
+                  <pic:blipFill>
+                    <a:blip r:embed="rId12"/>
+                    <a:stretch>
+                      <a:fillRect/>
+                    </a:stretch>
+                  </pic:blipFill>
+                  <pic:spPr>
+                    <a:xfrm>
+                      <a:off x="0" y="0"/>
+                      <a:ext cx="2864564" cy="1929640"/>
+                    </a:xfrm>
+                    <a:prstGeom prst="rect">
+                      <a:avLst/>
+                    </a:prstGeom>
+                  </pic:spPr>
+                </pic:pic>
+              </a:graphicData>
+            </a:graphic>
+          </wp:inline>
+        </w:drawing>
+      </w:r>
+      <w:r>
+        <w:t xml:space="preserve">     </w:t>
+      </w:r>
+      <w:r>
+        <w:drawing>
+          <wp:inline distT="0" distB="0" distL="0" distR="0" wp14:anchorId="6D4FA111" wp14:editId="7AD780D0">
+            <wp:extent cx="624894" cy="670618"/>
+            <wp:effectExtent l="0" t="0" r="3810" b="0"/>
+            <wp:docPr id="63075014" name="Picture 1" descr="A black background with white letters&#10;&#10;AI-generated content may be incorrect."/>
+            <wp:cNvGraphicFramePr>
+              <a:graphicFrameLocks xmlns:a="http://schemas.openxmlformats.org/drawingml/2006/main" noChangeAspect="1"/>
+            </wp:cNvGraphicFramePr>
+            <a:graphic xmlns:a="http://schemas.openxmlformats.org/drawingml/2006/main">
+              <a:graphicData uri="http://schemas.openxmlformats.org/drawingml/2006/picture">
+                <pic:pic xmlns:pic="http://schemas.openxmlformats.org/drawingml/2006/picture">
+                  <pic:nvPicPr>
+                    <pic:cNvPr id="63075014" name="Picture 1" descr="A black background with white letters&#10;&#10;AI-generated content may be incorrect."/>
+                    <pic:cNvPicPr/>
+                  </pic:nvPicPr>
+                  <pic:blipFill>
+                    <a:blip r:embed="rId13"/>
+                    <a:stretch>
+                      <a:fillRect/>
+                    </a:stretch>
+                  </pic:blipFill>
+                  <pic:spPr>
+                    <a:xfrm>
+                      <a:off x="0" y="0"/>
+                      <a:ext cx="624894" cy="670618"/>
+                    </a:xfrm>
+                    <a:prstGeom prst="rect">
+                      <a:avLst/>
+                    </a:prstGeom>
+                  </pic:spPr>
+                </pic:pic>
+              </a:graphicData>
+            </a:graphic>
+          </wp:inline>
+        </w:drawing>
+      </w:r>
+    </w:p>
     <w:p/>
     <w:sectPr>
       <w:pgSz w:w="11906" w:h="16838"/>

</xml_diff>

<commit_message>
updating comments for clarity.
</commit_message>
<xml_diff>
--- a/Notes/DSA Notes.docx
+++ b/Notes/DSA Notes.docx
@@ -3172,6 +3172,9 @@
     </w:p>
     <w:p>
       <w:r>
+        <w:rPr>
+          <w:noProof/>
+        </w:rPr>
         <w:lastRenderedPageBreak/>
         <w:drawing>
           <wp:inline distT="0" distB="0" distL="0" distR="0" wp14:anchorId="0F75AB8F" wp14:editId="15861F66">
@@ -3225,6 +3228,9 @@
         <w:t xml:space="preserve"> </w:t>
       </w:r>
       <w:r>
+        <w:rPr>
+          <w:noProof/>
+        </w:rPr>
         <w:drawing>
           <wp:inline distT="0" distB="0" distL="0" distR="0" wp14:anchorId="460BFA5F" wp14:editId="55991D17">
             <wp:extent cx="472481" cy="670618"/>
@@ -3264,6 +3270,9 @@
     </w:p>
     <w:p>
       <w:r>
+        <w:rPr>
+          <w:noProof/>
+        </w:rPr>
         <w:drawing>
           <wp:inline distT="0" distB="0" distL="0" distR="0" wp14:anchorId="5D0A6885" wp14:editId="1348C3AB">
             <wp:extent cx="2850610" cy="1920240"/>
@@ -3304,6 +3313,9 @@
         <w:t xml:space="preserve">     </w:t>
       </w:r>
       <w:r>
+        <w:rPr>
+          <w:noProof/>
+        </w:rPr>
         <w:drawing>
           <wp:inline distT="0" distB="0" distL="0" distR="0" wp14:anchorId="6D4FA111" wp14:editId="7AD780D0">
             <wp:extent cx="624894" cy="670618"/>
@@ -3341,6 +3353,86 @@
         </w:drawing>
       </w:r>
     </w:p>
+    <w:p>
+      <w:r>
+        <w:drawing>
+          <wp:inline distT="0" distB="0" distL="0" distR="0" wp14:anchorId="3D788B14" wp14:editId="5BD05096">
+            <wp:extent cx="4509485" cy="2026920"/>
+            <wp:effectExtent l="0" t="0" r="5715" b="0"/>
+            <wp:docPr id="117065478" name="Picture 1"/>
+            <wp:cNvGraphicFramePr>
+              <a:graphicFrameLocks xmlns:a="http://schemas.openxmlformats.org/drawingml/2006/main" noChangeAspect="1"/>
+            </wp:cNvGraphicFramePr>
+            <a:graphic xmlns:a="http://schemas.openxmlformats.org/drawingml/2006/main">
+              <a:graphicData uri="http://schemas.openxmlformats.org/drawingml/2006/picture">
+                <pic:pic xmlns:pic="http://schemas.openxmlformats.org/drawingml/2006/picture">
+                  <pic:nvPicPr>
+                    <pic:cNvPr id="117065478" name=""/>
+                    <pic:cNvPicPr/>
+                  </pic:nvPicPr>
+                  <pic:blipFill>
+                    <a:blip r:embed="rId14"/>
+                    <a:stretch>
+                      <a:fillRect/>
+                    </a:stretch>
+                  </pic:blipFill>
+                  <pic:spPr>
+                    <a:xfrm>
+                      <a:off x="0" y="0"/>
+                      <a:ext cx="4521728" cy="2032423"/>
+                    </a:xfrm>
+                    <a:prstGeom prst="rect">
+                      <a:avLst/>
+                    </a:prstGeom>
+                  </pic:spPr>
+                </pic:pic>
+              </a:graphicData>
+            </a:graphic>
+          </wp:inline>
+        </w:drawing>
+      </w:r>
+      <w:r>
+        <w:t xml:space="preserve">   </w:t>
+      </w:r>
+      <w:r>
+        <w:drawing>
+          <wp:inline distT="0" distB="0" distL="0" distR="0" wp14:anchorId="1DA0A2BB" wp14:editId="3C8FDAE5">
+            <wp:extent cx="1089754" cy="518205"/>
+            <wp:effectExtent l="0" t="0" r="0" b="0"/>
+            <wp:docPr id="1163987727" name="Picture 1" descr="A black screen with white text&#10;&#10;AI-generated content may be incorrect."/>
+            <wp:cNvGraphicFramePr>
+              <a:graphicFrameLocks xmlns:a="http://schemas.openxmlformats.org/drawingml/2006/main" noChangeAspect="1"/>
+            </wp:cNvGraphicFramePr>
+            <a:graphic xmlns:a="http://schemas.openxmlformats.org/drawingml/2006/main">
+              <a:graphicData uri="http://schemas.openxmlformats.org/drawingml/2006/picture">
+                <pic:pic xmlns:pic="http://schemas.openxmlformats.org/drawingml/2006/picture">
+                  <pic:nvPicPr>
+                    <pic:cNvPr id="1163987727" name="Picture 1" descr="A black screen with white text&#10;&#10;AI-generated content may be incorrect."/>
+                    <pic:cNvPicPr/>
+                  </pic:nvPicPr>
+                  <pic:blipFill>
+                    <a:blip r:embed="rId15"/>
+                    <a:stretch>
+                      <a:fillRect/>
+                    </a:stretch>
+                  </pic:blipFill>
+                  <pic:spPr>
+                    <a:xfrm>
+                      <a:off x="0" y="0"/>
+                      <a:ext cx="1089754" cy="518205"/>
+                    </a:xfrm>
+                    <a:prstGeom prst="rect">
+                      <a:avLst/>
+                    </a:prstGeom>
+                  </pic:spPr>
+                </pic:pic>
+              </a:graphicData>
+            </a:graphic>
+          </wp:inline>
+        </w:drawing>
+      </w:r>
+    </w:p>
+    <w:p/>
     <w:p/>
     <w:sectPr>
       <w:pgSz w:w="11906" w:h="16838"/>

</xml_diff>

<commit_message>
swap values of two integers and update workspace settings to track changes in JavaBasics and DSA Notes document.
</commit_message>
<xml_diff>
--- a/Notes/DSA Notes.docx
+++ b/Notes/DSA Notes.docx
@@ -281,41 +281,17 @@
     </w:p>
     <w:p>
       <w:r>
-        <w:t xml:space="preserve">  </w:t>
-      </w:r>
-      <w:proofErr w:type="gramStart"/>
-      <w:r>
-        <w:t>Add(</w:t>
-      </w:r>
-      <w:proofErr w:type="gramEnd"/>
-      <w:r>
-        <w:t xml:space="preserve">tea leaves)  </w:t>
+        <w:t xml:space="preserve">  Add(tea leaves)  </w:t>
       </w:r>
     </w:p>
     <w:p>
       <w:r>
-        <w:t xml:space="preserve">  </w:t>
-      </w:r>
-      <w:proofErr w:type="gramStart"/>
-      <w:r>
-        <w:t>Add(</w:t>
-      </w:r>
-      <w:proofErr w:type="gramEnd"/>
-      <w:r>
-        <w:t xml:space="preserve">sugar, milk)  </w:t>
+        <w:t xml:space="preserve">  Add(sugar, milk)  </w:t>
       </w:r>
     </w:p>
     <w:p>
       <w:r>
-        <w:t xml:space="preserve">  </w:t>
-      </w:r>
-      <w:proofErr w:type="gramStart"/>
-      <w:r>
-        <w:t>Boil(</w:t>
-      </w:r>
-      <w:proofErr w:type="gramEnd"/>
-      <w:r>
-        <w:t xml:space="preserve">2 minutes)  </w:t>
+        <w:t xml:space="preserve">  Boil(2 minutes)  </w:t>
       </w:r>
     </w:p>
     <w:p>
@@ -2872,23 +2848,7 @@
           <w:b/>
           <w:bCs/>
         </w:rPr>
-        <w:t xml:space="preserve"> 8. </w:t>
-      </w:r>
-      <w:proofErr w:type="spellStart"/>
-      <w:r>
-        <w:rPr>
-          <w:b/>
-          <w:bCs/>
-        </w:rPr>
-        <w:t>instanceof</w:t>
-      </w:r>
-      <w:proofErr w:type="spellEnd"/>
-      <w:r>
-        <w:rPr>
-          <w:b/>
-          <w:bCs/>
-        </w:rPr>
-        <w:t xml:space="preserve"> Operator</w:t>
+        <w:t xml:space="preserve"> 8. instanceof Operator</w:t>
       </w:r>
     </w:p>
     <w:p>
@@ -2996,11 +2956,9 @@
             <w:hideMark/>
           </w:tcPr>
           <w:p>
-            <w:proofErr w:type="spellStart"/>
             <w:r>
               <w:t>instanceof</w:t>
             </w:r>
-            <w:proofErr w:type="spellEnd"/>
           </w:p>
         </w:tc>
         <w:tc>
@@ -3022,21 +2980,8 @@
             <w:hideMark/>
           </w:tcPr>
           <w:p>
-            <w:proofErr w:type="spellStart"/>
-            <w:r>
-              <w:t>obj</w:t>
-            </w:r>
-            <w:proofErr w:type="spellEnd"/>
-            <w:r>
-              <w:t xml:space="preserve"> </w:t>
-            </w:r>
-            <w:proofErr w:type="spellStart"/>
-            <w:r>
-              <w:t>instanceof</w:t>
-            </w:r>
-            <w:proofErr w:type="spellEnd"/>
-            <w:r>
-              <w:t xml:space="preserve"> String</w:t>
+            <w:r>
+              <w:t>obj instanceof String</w:t>
             </w:r>
           </w:p>
         </w:tc>
@@ -3356,6 +3301,45 @@
     <w:p>
       <w:r>
         <w:drawing>
+          <wp:inline distT="0" distB="0" distL="0" distR="0" wp14:anchorId="4A613468" wp14:editId="0E245BCA">
+            <wp:extent cx="4778154" cy="3101609"/>
+            <wp:effectExtent l="0" t="0" r="3810" b="3810"/>
+            <wp:docPr id="1689763892" name="Picture 1"/>
+            <wp:cNvGraphicFramePr>
+              <a:graphicFrameLocks xmlns:a="http://schemas.openxmlformats.org/drawingml/2006/main" noChangeAspect="1"/>
+            </wp:cNvGraphicFramePr>
+            <a:graphic xmlns:a="http://schemas.openxmlformats.org/drawingml/2006/main">
+              <a:graphicData uri="http://schemas.openxmlformats.org/drawingml/2006/picture">
+                <pic:pic xmlns:pic="http://schemas.openxmlformats.org/drawingml/2006/picture">
+                  <pic:nvPicPr>
+                    <pic:cNvPr id="1689763892" name=""/>
+                    <pic:cNvPicPr/>
+                  </pic:nvPicPr>
+                  <pic:blipFill>
+                    <a:blip r:embed="rId14"/>
+                    <a:stretch>
+                      <a:fillRect/>
+                    </a:stretch>
+                  </pic:blipFill>
+                  <pic:spPr>
+                    <a:xfrm>
+                      <a:off x="0" y="0"/>
+                      <a:ext cx="4778154" cy="3101609"/>
+                    </a:xfrm>
+                    <a:prstGeom prst="rect">
+                      <a:avLst/>
+                    </a:prstGeom>
+                  </pic:spPr>
+                </pic:pic>
+              </a:graphicData>
+            </a:graphic>
+          </wp:inline>
+        </w:drawing>
+      </w:r>
+    </w:p>
+    <w:p>
+      <w:r>
+        <w:drawing>
           <wp:inline distT="0" distB="0" distL="0" distR="0" wp14:anchorId="3D788B14" wp14:editId="5BD05096">
             <wp:extent cx="4509485" cy="2026920"/>
             <wp:effectExtent l="0" t="0" r="5715" b="0"/>
@@ -3371,7 +3355,7 @@
                     <pic:cNvPicPr/>
                   </pic:nvPicPr>
                   <pic:blipFill>
-                    <a:blip r:embed="rId14"/>
+                    <a:blip r:embed="rId15"/>
                     <a:stretch>
                       <a:fillRect/>
                     </a:stretch>
@@ -3411,7 +3395,7 @@
                     <pic:cNvPicPr/>
                   </pic:nvPicPr>
                   <pic:blipFill>
-                    <a:blip r:embed="rId15"/>
+                    <a:blip r:embed="rId16"/>
                     <a:stretch>
                       <a:fillRect/>
                     </a:stretch>
@@ -3432,7 +3416,46 @@
         </w:drawing>
       </w:r>
     </w:p>
-    <w:p/>
+    <w:p>
+      <w:r>
+        <w:lastRenderedPageBreak/>
+        <w:drawing>
+          <wp:inline distT="0" distB="0" distL="0" distR="0" wp14:anchorId="72A858E0" wp14:editId="3B7F83BD">
+            <wp:extent cx="5731510" cy="2731135"/>
+            <wp:effectExtent l="0" t="0" r="2540" b="0"/>
+            <wp:docPr id="300410651" name="Picture 1" descr="A blackboard with text and a diagram&#10;&#10;AI-generated content may be incorrect."/>
+            <wp:cNvGraphicFramePr>
+              <a:graphicFrameLocks xmlns:a="http://schemas.openxmlformats.org/drawingml/2006/main" noChangeAspect="1"/>
+            </wp:cNvGraphicFramePr>
+            <a:graphic xmlns:a="http://schemas.openxmlformats.org/drawingml/2006/main">
+              <a:graphicData uri="http://schemas.openxmlformats.org/drawingml/2006/picture">
+                <pic:pic xmlns:pic="http://schemas.openxmlformats.org/drawingml/2006/picture">
+                  <pic:nvPicPr>
+                    <pic:cNvPr id="300410651" name="Picture 1" descr="A blackboard with text and a diagram&#10;&#10;AI-generated content may be incorrect."/>
+                    <pic:cNvPicPr/>
+                  </pic:nvPicPr>
+                  <pic:blipFill>
+                    <a:blip r:embed="rId17"/>
+                    <a:stretch>
+                      <a:fillRect/>
+                    </a:stretch>
+                  </pic:blipFill>
+                  <pic:spPr>
+                    <a:xfrm>
+                      <a:off x="0" y="0"/>
+                      <a:ext cx="5731510" cy="2731135"/>
+                    </a:xfrm>
+                    <a:prstGeom prst="rect">
+                      <a:avLst/>
+                    </a:prstGeom>
+                  </pic:spPr>
+                </pic:pic>
+              </a:graphicData>
+            </a:graphic>
+          </wp:inline>
+        </w:drawing>
+      </w:r>
+    </w:p>
     <w:p/>
     <w:sectPr>
       <w:pgSz w:w="11906" w:h="16838"/>

</xml_diff>

<commit_message>
implement a multiply method, and update DSA Notes with explanations on call by value and call by reference in Java.
</commit_message>
<xml_diff>
--- a/Notes/DSA Notes.docx
+++ b/Notes/DSA Notes.docx
@@ -281,17 +281,41 @@
     </w:p>
     <w:p>
       <w:r>
-        <w:t xml:space="preserve">  Add(tea leaves)  </w:t>
-      </w:r>
-    </w:p>
-    <w:p>
-      <w:r>
-        <w:t xml:space="preserve">  Add(sugar, milk)  </w:t>
-      </w:r>
-    </w:p>
-    <w:p>
-      <w:r>
-        <w:t xml:space="preserve">  Boil(2 minutes)  </w:t>
+        <w:t xml:space="preserve">  </w:t>
+      </w:r>
+      <w:proofErr w:type="gramStart"/>
+      <w:r>
+        <w:t>Add(</w:t>
+      </w:r>
+      <w:proofErr w:type="gramEnd"/>
+      <w:r>
+        <w:t xml:space="preserve">tea leaves)  </w:t>
+      </w:r>
+    </w:p>
+    <w:p>
+      <w:r>
+        <w:t xml:space="preserve">  </w:t>
+      </w:r>
+      <w:proofErr w:type="gramStart"/>
+      <w:r>
+        <w:t>Add(</w:t>
+      </w:r>
+      <w:proofErr w:type="gramEnd"/>
+      <w:r>
+        <w:t xml:space="preserve">sugar, milk)  </w:t>
+      </w:r>
+    </w:p>
+    <w:p>
+      <w:r>
+        <w:t xml:space="preserve">  </w:t>
+      </w:r>
+      <w:proofErr w:type="gramStart"/>
+      <w:r>
+        <w:t>Boil(</w:t>
+      </w:r>
+      <w:proofErr w:type="gramEnd"/>
+      <w:r>
+        <w:t xml:space="preserve">2 minutes)  </w:t>
       </w:r>
     </w:p>
     <w:p>
@@ -1134,8 +1158,13 @@
             <w:hideMark/>
           </w:tcPr>
           <w:p>
-            <w:r>
-              <w:t>a != b</w:t>
+            <w:proofErr w:type="gramStart"/>
+            <w:r>
+              <w:t>a !</w:t>
+            </w:r>
+            <w:proofErr w:type="gramEnd"/>
+            <w:r>
+              <w:t>= b</w:t>
             </w:r>
           </w:p>
         </w:tc>
@@ -1562,8 +1591,13 @@
             <w:r>
               <w:t xml:space="preserve">     </w:t>
             </w:r>
-            <w:r>
-              <w:t>!(a &gt; b)</w:t>
+            <w:proofErr w:type="gramStart"/>
+            <w:r>
+              <w:t>!(</w:t>
+            </w:r>
+            <w:proofErr w:type="gramEnd"/>
+            <w:r>
+              <w:t>a &gt; b)</w:t>
             </w:r>
           </w:p>
         </w:tc>
@@ -2253,9 +2287,11 @@
             <w:hideMark/>
           </w:tcPr>
           <w:p>
+            <w:proofErr w:type="gramStart"/>
             <w:r>
               <w:t>!true</w:t>
             </w:r>
+            <w:proofErr w:type="gramEnd"/>
           </w:p>
         </w:tc>
       </w:tr>
@@ -2821,7 +2857,23 @@
           </w:tcPr>
           <w:p>
             <w:r>
-              <w:t>a &gt; b ? a : b</w:t>
+              <w:t xml:space="preserve">a &gt; </w:t>
+            </w:r>
+            <w:proofErr w:type="gramStart"/>
+            <w:r>
+              <w:t>b ?</w:t>
+            </w:r>
+            <w:proofErr w:type="gramEnd"/>
+            <w:r>
+              <w:t xml:space="preserve"> </w:t>
+            </w:r>
+            <w:proofErr w:type="gramStart"/>
+            <w:r>
+              <w:t>a :</w:t>
+            </w:r>
+            <w:proofErr w:type="gramEnd"/>
+            <w:r>
+              <w:t xml:space="preserve"> b</w:t>
             </w:r>
           </w:p>
         </w:tc>
@@ -2848,7 +2900,23 @@
           <w:b/>
           <w:bCs/>
         </w:rPr>
-        <w:t xml:space="preserve"> 8. instanceof Operator</w:t>
+        <w:t xml:space="preserve"> 8. </w:t>
+      </w:r>
+      <w:proofErr w:type="spellStart"/>
+      <w:r>
+        <w:rPr>
+          <w:b/>
+          <w:bCs/>
+        </w:rPr>
+        <w:t>instanceof</w:t>
+      </w:r>
+      <w:proofErr w:type="spellEnd"/>
+      <w:r>
+        <w:rPr>
+          <w:b/>
+          <w:bCs/>
+        </w:rPr>
+        <w:t xml:space="preserve"> Operator</w:t>
       </w:r>
     </w:p>
     <w:p>
@@ -2956,9 +3024,11 @@
             <w:hideMark/>
           </w:tcPr>
           <w:p>
+            <w:proofErr w:type="spellStart"/>
             <w:r>
               <w:t>instanceof</w:t>
             </w:r>
+            <w:proofErr w:type="spellEnd"/>
           </w:p>
         </w:tc>
         <w:tc>
@@ -2980,8 +3050,21 @@
             <w:hideMark/>
           </w:tcPr>
           <w:p>
-            <w:r>
-              <w:t>obj instanceof String</w:t>
+            <w:proofErr w:type="spellStart"/>
+            <w:r>
+              <w:t>obj</w:t>
+            </w:r>
+            <w:proofErr w:type="spellEnd"/>
+            <w:r>
+              <w:t xml:space="preserve"> </w:t>
+            </w:r>
+            <w:proofErr w:type="spellStart"/>
+            <w:r>
+              <w:t>instanceof</w:t>
+            </w:r>
+            <w:proofErr w:type="spellEnd"/>
+            <w:r>
+              <w:t xml:space="preserve"> String</w:t>
             </w:r>
           </w:p>
         </w:tc>
@@ -3300,6 +3383,9 @@
     </w:p>
     <w:p>
       <w:r>
+        <w:rPr>
+          <w:noProof/>
+        </w:rPr>
         <w:drawing>
           <wp:inline distT="0" distB="0" distL="0" distR="0" wp14:anchorId="4A613468" wp14:editId="0E245BCA">
             <wp:extent cx="4778154" cy="3101609"/>
@@ -3339,6 +3425,9 @@
     </w:p>
     <w:p>
       <w:r>
+        <w:rPr>
+          <w:noProof/>
+        </w:rPr>
         <w:drawing>
           <wp:inline distT="0" distB="0" distL="0" distR="0" wp14:anchorId="3D788B14" wp14:editId="5BD05096">
             <wp:extent cx="4509485" cy="2026920"/>
@@ -3379,6 +3468,9 @@
         <w:t xml:space="preserve">   </w:t>
       </w:r>
       <w:r>
+        <w:rPr>
+          <w:noProof/>
+        </w:rPr>
         <w:drawing>
           <wp:inline distT="0" distB="0" distL="0" distR="0" wp14:anchorId="1DA0A2BB" wp14:editId="3C8FDAE5">
             <wp:extent cx="1089754" cy="518205"/>
@@ -3418,6 +3510,9 @@
     </w:p>
     <w:p>
       <w:r>
+        <w:rPr>
+          <w:noProof/>
+        </w:rPr>
         <w:lastRenderedPageBreak/>
         <w:drawing>
           <wp:inline distT="0" distB="0" distL="0" distR="0" wp14:anchorId="72A858E0" wp14:editId="3B7F83BD">
@@ -3457,6 +3552,415 @@
       </w:r>
     </w:p>
     <w:p/>
+    <w:p>
+      <w:pPr>
+        <w:rPr>
+          <w:b/>
+          <w:bCs/>
+        </w:rPr>
+      </w:pPr>
+      <w:r>
+        <w:rPr>
+          <w:rFonts w:ascii="Segoe UI Emoji" w:hAnsi="Segoe UI Emoji" w:cs="Segoe UI Emoji"/>
+          <w:b/>
+          <w:bCs/>
+        </w:rPr>
+        <w:t xml:space="preserve">Q. </w:t>
+      </w:r>
+      <w:r>
+        <w:rPr>
+          <w:b/>
+          <w:bCs/>
+        </w:rPr>
+        <w:t xml:space="preserve"> Call by Value vs Call by Reference in Java</w:t>
+      </w:r>
+    </w:p>
+    <w:p>
+      <w:pPr>
+        <w:rPr>
+          <w:b/>
+          <w:bCs/>
+        </w:rPr>
+      </w:pPr>
+      <w:r>
+        <w:rPr>
+          <w:rFonts w:ascii="Segoe UI Emoji" w:hAnsi="Segoe UI Emoji" w:cs="Segoe UI Emoji"/>
+          <w:b/>
+          <w:bCs/>
+        </w:rPr>
+        <w:t>🔹</w:t>
+      </w:r>
+      <w:r>
+        <w:rPr>
+          <w:b/>
+          <w:bCs/>
+        </w:rPr>
+        <w:t xml:space="preserve"> 1. Call by Value (Java uses this)</w:t>
+      </w:r>
+    </w:p>
+    <w:p>
+      <w:pPr>
+        <w:numPr>
+          <w:ilvl w:val="0"/>
+          <w:numId w:val="3"/>
+        </w:numPr>
+      </w:pPr>
+      <w:r>
+        <w:t xml:space="preserve">A </w:t>
+      </w:r>
+      <w:r>
+        <w:rPr>
+          <w:b/>
+          <w:bCs/>
+        </w:rPr>
+        <w:t>copy</w:t>
+      </w:r>
+      <w:r>
+        <w:t xml:space="preserve"> of the variable is passed.</w:t>
+      </w:r>
+    </w:p>
+    <w:p>
+      <w:pPr>
+        <w:numPr>
+          <w:ilvl w:val="0"/>
+          <w:numId w:val="3"/>
+        </w:numPr>
+      </w:pPr>
+      <w:r>
+        <w:t xml:space="preserve">Changes made to the parameter </w:t>
+      </w:r>
+      <w:r>
+        <w:rPr>
+          <w:b/>
+          <w:bCs/>
+        </w:rPr>
+        <w:t>do not affect</w:t>
+      </w:r>
+      <w:r>
+        <w:t xml:space="preserve"> the original variable.</w:t>
+      </w:r>
+    </w:p>
+    <w:p>
+      <w:pPr>
+        <w:rPr>
+          <w:b/>
+          <w:bCs/>
+        </w:rPr>
+      </w:pPr>
+      <w:r>
+        <w:rPr>
+          <w:rFonts w:ascii="Segoe UI Emoji" w:hAnsi="Segoe UI Emoji" w:cs="Segoe UI Emoji"/>
+          <w:b/>
+          <w:bCs/>
+        </w:rPr>
+        <w:t>✅</w:t>
+      </w:r>
+      <w:r>
+        <w:rPr>
+          <w:b/>
+          <w:bCs/>
+        </w:rPr>
+        <w:t xml:space="preserve"> Example (Primitive Type):</w:t>
+      </w:r>
+    </w:p>
+    <w:p>
+      <w:pPr>
+        <w:rPr>
+          <w:b/>
+          <w:bCs/>
+        </w:rPr>
+      </w:pPr>
+      <w:r>
+        <w:rPr>
+          <w:b/>
+          <w:bCs/>
+        </w:rPr>
+        <w:drawing>
+          <wp:inline distT="0" distB="0" distL="0" distR="0" wp14:anchorId="4E5C5314" wp14:editId="46EBF444">
+            <wp:extent cx="3939881" cy="2865368"/>
+            <wp:effectExtent l="0" t="0" r="3810" b="0"/>
+            <wp:docPr id="1827938943" name="Picture 1"/>
+            <wp:cNvGraphicFramePr>
+              <a:graphicFrameLocks xmlns:a="http://schemas.openxmlformats.org/drawingml/2006/main" noChangeAspect="1"/>
+            </wp:cNvGraphicFramePr>
+            <a:graphic xmlns:a="http://schemas.openxmlformats.org/drawingml/2006/main">
+              <a:graphicData uri="http://schemas.openxmlformats.org/drawingml/2006/picture">
+                <pic:pic xmlns:pic="http://schemas.openxmlformats.org/drawingml/2006/picture">
+                  <pic:nvPicPr>
+                    <pic:cNvPr id="1827938943" name=""/>
+                    <pic:cNvPicPr/>
+                  </pic:nvPicPr>
+                  <pic:blipFill>
+                    <a:blip r:embed="rId18"/>
+                    <a:stretch>
+                      <a:fillRect/>
+                    </a:stretch>
+                  </pic:blipFill>
+                  <pic:spPr>
+                    <a:xfrm>
+                      <a:off x="0" y="0"/>
+                      <a:ext cx="3939881" cy="2865368"/>
+                    </a:xfrm>
+                    <a:prstGeom prst="rect">
+                      <a:avLst/>
+                    </a:prstGeom>
+                  </pic:spPr>
+                </pic:pic>
+              </a:graphicData>
+            </a:graphic>
+          </wp:inline>
+        </w:drawing>
+      </w:r>
+    </w:p>
+    <w:p>
+      <w:r>
+        <w:rPr>
+          <w:rFonts w:ascii="Segoe UI Emoji" w:hAnsi="Segoe UI Emoji" w:cs="Segoe UI Emoji"/>
+        </w:rPr>
+        <w:t>➡️</w:t>
+      </w:r>
+      <w:r>
+        <w:t xml:space="preserve"> The original a remains 10 — because x is just a copy.</w:t>
+      </w:r>
+    </w:p>
+    <w:p>
+      <w:r>
+        <w:pict w14:anchorId="2BA9D92B">
+          <v:rect id="_x0000_i1050" style="width:0;height:1.5pt" o:hralign="center" o:hrstd="t" o:hr="t" fillcolor="#a0a0a0" stroked="f"/>
+        </w:pict>
+      </w:r>
+    </w:p>
+    <w:p>
+      <w:pPr>
+        <w:rPr>
+          <w:b/>
+          <w:bCs/>
+        </w:rPr>
+      </w:pPr>
+      <w:r>
+        <w:rPr>
+          <w:rFonts w:ascii="Segoe UI Emoji" w:hAnsi="Segoe UI Emoji" w:cs="Segoe UI Emoji"/>
+          <w:b/>
+          <w:bCs/>
+        </w:rPr>
+        <w:t>🔹</w:t>
+      </w:r>
+      <w:r>
+        <w:rPr>
+          <w:b/>
+          <w:bCs/>
+        </w:rPr>
+        <w:t xml:space="preserve"> 2. Call by Reference (Java does NOT use this)</w:t>
+      </w:r>
+    </w:p>
+    <w:p>
+      <w:pPr>
+        <w:numPr>
+          <w:ilvl w:val="0"/>
+          <w:numId w:val="4"/>
+        </w:numPr>
+      </w:pPr>
+      <w:r>
+        <w:t xml:space="preserve">A </w:t>
+      </w:r>
+      <w:r>
+        <w:rPr>
+          <w:b/>
+          <w:bCs/>
+        </w:rPr>
+        <w:t>reference (address)</w:t>
+      </w:r>
+      <w:r>
+        <w:t xml:space="preserve"> to the original variable is passed.</w:t>
+      </w:r>
+    </w:p>
+    <w:p>
+      <w:pPr>
+        <w:numPr>
+          <w:ilvl w:val="0"/>
+          <w:numId w:val="4"/>
+        </w:numPr>
+      </w:pPr>
+      <w:r>
+        <w:lastRenderedPageBreak/>
+        <w:t xml:space="preserve">Changes affect the </w:t>
+      </w:r>
+      <w:r>
+        <w:rPr>
+          <w:b/>
+          <w:bCs/>
+        </w:rPr>
+        <w:t>original</w:t>
+      </w:r>
+      <w:r>
+        <w:t xml:space="preserve"> data.</w:t>
+      </w:r>
+    </w:p>
+    <w:p>
+      <w:r>
+        <w:rPr>
+          <w:rFonts w:ascii="Segoe UI Emoji" w:hAnsi="Segoe UI Emoji" w:cs="Segoe UI Emoji"/>
+        </w:rPr>
+        <w:t>☝️</w:t>
+      </w:r>
+      <w:r>
+        <w:t xml:space="preserve"> Java does </w:t>
+      </w:r>
+      <w:r>
+        <w:rPr>
+          <w:b/>
+          <w:bCs/>
+        </w:rPr>
+        <w:t>not</w:t>
+      </w:r>
+      <w:r>
+        <w:t xml:space="preserve"> support true call by reference. But when you pass an object, the </w:t>
+      </w:r>
+      <w:r>
+        <w:rPr>
+          <w:b/>
+          <w:bCs/>
+        </w:rPr>
+        <w:t>reference is passed by value</w:t>
+      </w:r>
+      <w:r>
+        <w:t>.</w:t>
+      </w:r>
+    </w:p>
+    <w:p>
+      <w:pPr>
+        <w:rPr>
+          <w:b/>
+          <w:bCs/>
+        </w:rPr>
+      </w:pPr>
+      <w:r>
+        <w:rPr>
+          <w:rFonts w:ascii="Segoe UI Emoji" w:hAnsi="Segoe UI Emoji" w:cs="Segoe UI Emoji"/>
+          <w:b/>
+          <w:bCs/>
+        </w:rPr>
+        <w:t>✅</w:t>
+      </w:r>
+      <w:r>
+        <w:rPr>
+          <w:b/>
+          <w:bCs/>
+        </w:rPr>
+        <w:t xml:space="preserve"> Example (Object):</w:t>
+      </w:r>
+    </w:p>
+    <w:p>
+      <w:pPr>
+        <w:rPr>
+          <w:b/>
+          <w:bCs/>
+        </w:rPr>
+      </w:pPr>
+      <w:r>
+        <w:rPr>
+          <w:b/>
+          <w:bCs/>
+        </w:rPr>
+        <w:drawing>
+          <wp:inline distT="0" distB="0" distL="0" distR="0" wp14:anchorId="7F6CDBDE" wp14:editId="28E4BC63">
+            <wp:extent cx="4732430" cy="3810330"/>
+            <wp:effectExtent l="0" t="0" r="0" b="0"/>
+            <wp:docPr id="400978398" name="Picture 1" descr="A screenshot of a computer code&#10;&#10;AI-generated content may be incorrect."/>
+            <wp:cNvGraphicFramePr>
+              <a:graphicFrameLocks xmlns:a="http://schemas.openxmlformats.org/drawingml/2006/main" noChangeAspect="1"/>
+            </wp:cNvGraphicFramePr>
+            <a:graphic xmlns:a="http://schemas.openxmlformats.org/drawingml/2006/main">
+              <a:graphicData uri="http://schemas.openxmlformats.org/drawingml/2006/picture">
+                <pic:pic xmlns:pic="http://schemas.openxmlformats.org/drawingml/2006/picture">
+                  <pic:nvPicPr>
+                    <pic:cNvPr id="400978398" name="Picture 1" descr="A screenshot of a computer code&#10;&#10;AI-generated content may be incorrect."/>
+                    <pic:cNvPicPr/>
+                  </pic:nvPicPr>
+                  <pic:blipFill>
+                    <a:blip r:embed="rId19"/>
+                    <a:stretch>
+                      <a:fillRect/>
+                    </a:stretch>
+                  </pic:blipFill>
+                  <pic:spPr>
+                    <a:xfrm>
+                      <a:off x="0" y="0"/>
+                      <a:ext cx="4732430" cy="3810330"/>
+                    </a:xfrm>
+                    <a:prstGeom prst="rect">
+                      <a:avLst/>
+                    </a:prstGeom>
+                  </pic:spPr>
+                </pic:pic>
+              </a:graphicData>
+            </a:graphic>
+          </wp:inline>
+        </w:drawing>
+      </w:r>
+    </w:p>
+    <w:p>
+      <w:r>
+        <w:rPr>
+          <w:rFonts w:ascii="Segoe UI Emoji" w:hAnsi="Segoe UI Emoji" w:cs="Segoe UI Emoji"/>
+        </w:rPr>
+        <w:t>➡️</w:t>
+      </w:r>
+      <w:r>
+        <w:t xml:space="preserve"> Although the reference is passed by value, changes made </w:t>
+      </w:r>
+      <w:r>
+        <w:rPr>
+          <w:b/>
+          <w:bCs/>
+        </w:rPr>
+        <w:t>inside the object</w:t>
+      </w:r>
+      <w:r>
+        <w:t xml:space="preserve"> affect the original object.</w:t>
+      </w:r>
+    </w:p>
+    <w:p>
+      <w:r>
+        <w:drawing>
+          <wp:inline distT="0" distB="0" distL="0" distR="0" wp14:anchorId="54D01AD9" wp14:editId="73631111">
+            <wp:extent cx="5731510" cy="3064510"/>
+            <wp:effectExtent l="0" t="0" r="2540" b="2540"/>
+            <wp:docPr id="1836331460" name="Picture 1" descr="A black background with white text and symbols&#10;&#10;AI-generated content may be incorrect."/>
+            <wp:cNvGraphicFramePr>
+              <a:graphicFrameLocks xmlns:a="http://schemas.openxmlformats.org/drawingml/2006/main" noChangeAspect="1"/>
+            </wp:cNvGraphicFramePr>
+            <a:graphic xmlns:a="http://schemas.openxmlformats.org/drawingml/2006/main">
+              <a:graphicData uri="http://schemas.openxmlformats.org/drawingml/2006/picture">
+                <pic:pic xmlns:pic="http://schemas.openxmlformats.org/drawingml/2006/picture">
+                  <pic:nvPicPr>
+                    <pic:cNvPr id="1836331460" name="Picture 1" descr="A black background with white text and symbols&#10;&#10;AI-generated content may be incorrect."/>
+                    <pic:cNvPicPr/>
+                  </pic:nvPicPr>
+                  <pic:blipFill>
+                    <a:blip r:embed="rId20"/>
+                    <a:stretch>
+                      <a:fillRect/>
+                    </a:stretch>
+                  </pic:blipFill>
+                  <pic:spPr>
+                    <a:xfrm>
+                      <a:off x="0" y="0"/>
+                      <a:ext cx="5731510" cy="3064510"/>
+                    </a:xfrm>
+                    <a:prstGeom prst="rect">
+                      <a:avLst/>
+                    </a:prstGeom>
+                  </pic:spPr>
+                </pic:pic>
+              </a:graphicData>
+            </a:graphic>
+          </wp:inline>
+        </w:drawing>
+      </w:r>
+    </w:p>
+    <w:p/>
+    <w:p/>
     <w:sectPr>
       <w:pgSz w:w="11906" w:h="16838"/>
       <w:pgMar w:top="1440" w:right="1440" w:bottom="1440" w:left="1440" w:header="708" w:footer="708" w:gutter="0"/>
@@ -3520,6 +4024,155 @@
 <file path=word/numbering.xml><?xml version="1.0" encoding="utf-8"?>
 <w:numbering xmlns:wpc="http://schemas.microsoft.com/office/word/2010/wordprocessingCanvas" xmlns:cx="http://schemas.microsoft.com/office/drawing/2014/chartex" xmlns:cx1="http://schemas.microsoft.com/office/drawing/2015/9/8/chartex" xmlns:cx2="http://schemas.microsoft.com/office/drawing/2015/10/21/chartex" xmlns:cx3="http://schemas.microsoft.com/office/drawing/2016/5/9/chartex" xmlns:cx4="http://schemas.microsoft.com/office/drawing/2016/5/10/chartex" xmlns:cx5="http://schemas.microsoft.com/office/drawing/2016/5/11/chartex" xmlns:cx6="http://schemas.microsoft.com/office/drawing/2016/5/12/chartex" xmlns:cx7="http://schemas.microsoft.com/office/drawing/2016/5/13/chartex" xmlns:cx8="http://schemas.microsoft.com/office/drawing/2016/5/14/chartex" xmlns:mc="http://schemas.openxmlformats.org/markup-compatibility/2006" xmlns:aink="http://schemas.microsoft.com/office/drawing/2016/ink" xmlns:am3d="http://schemas.microsoft.com/office/drawing/2017/model3d" xmlns:o="urn:schemas-microsoft-com:office:office" xmlns:oel="http://schemas.microsoft.com/office/2019/extlst" xmlns:r="http://schemas.openxmlformats.org/officeDocument/2006/relationships" xmlns:m="http://schemas.openxmlformats.org/officeDocument/2006/math" xmlns:v="urn:schemas-microsoft-com:vml" xmlns:wp14="http://schemas.microsoft.com/office/word/2010/wordprocessingDrawing" xmlns:wp="http://schemas.openxmlformats.org/drawingml/2006/wordprocessingDrawing" xmlns:w10="urn:schemas-microsoft-com:office:word" xmlns:w="http://schemas.openxmlformats.org/wordprocessingml/2006/main" xmlns:w14="http://schemas.microsoft.com/office/word/2010/wordml" xmlns:w15="http://schemas.microsoft.com/office/word/2012/wordml" xmlns:w16cex="http://schemas.microsoft.com/office/word/2018/wordml/cex" xmlns:w16cid="http://schemas.microsoft.com/office/word/2016/wordml/cid" xmlns:w16="http://schemas.microsoft.com/office/word/2018/wordml" xmlns:w16du="http://schemas.microsoft.com/office/word/2023/wordml/word16du" xmlns:w16sdtdh="http://schemas.microsoft.com/office/word/2020/wordml/sdtdatahash" xmlns:w16sdtfl="http://schemas.microsoft.com/office/word/2024/wordml/sdtformatlock" xmlns:w16se="http://schemas.microsoft.com/office/word/2015/wordml/symex" xmlns:wpg="http://schemas.microsoft.com/office/word/2010/wordprocessingGroup" xmlns:wpi="http://schemas.microsoft.com/office/word/2010/wordprocessingInk" xmlns:wne="http://schemas.microsoft.com/office/word/2006/wordml" xmlns:wps="http://schemas.microsoft.com/office/word/2010/wordprocessingShape" mc:Ignorable="w14 w15 w16se w16cid w16 w16cex w16sdtdh w16sdtfl w16du wp14">
   <w:abstractNum w:abstractNumId="0" w15:restartNumberingAfterBreak="0">
+    <w:nsid w:val="41CF6605"/>
+    <w:multiLevelType w:val="multilevel"/>
+    <w:tmpl w:val="4CD02E12"/>
+    <w:lvl w:ilvl="0">
+      <w:start w:val="1"/>
+      <w:numFmt w:val="bullet"/>
+      <w:lvlText w:val=""/>
+      <w:lvlJc w:val="left"/>
+      <w:pPr>
+        <w:tabs>
+          <w:tab w:val="num" w:pos="720"/>
+        </w:tabs>
+        <w:ind w:left="720" w:hanging="360"/>
+      </w:pPr>
+      <w:rPr>
+        <w:rFonts w:ascii="Symbol" w:hAnsi="Symbol" w:hint="default"/>
+        <w:sz w:val="20"/>
+      </w:rPr>
+    </w:lvl>
+    <w:lvl w:ilvl="1" w:tentative="1">
+      <w:start w:val="1"/>
+      <w:numFmt w:val="bullet"/>
+      <w:lvlText w:val="o"/>
+      <w:lvlJc w:val="left"/>
+      <w:pPr>
+        <w:tabs>
+          <w:tab w:val="num" w:pos="1440"/>
+        </w:tabs>
+        <w:ind w:left="1440" w:hanging="360"/>
+      </w:pPr>
+      <w:rPr>
+        <w:rFonts w:ascii="Courier New" w:hAnsi="Courier New" w:hint="default"/>
+        <w:sz w:val="20"/>
+      </w:rPr>
+    </w:lvl>
+    <w:lvl w:ilvl="2" w:tentative="1">
+      <w:start w:val="1"/>
+      <w:numFmt w:val="bullet"/>
+      <w:lvlText w:val=""/>
+      <w:lvlJc w:val="left"/>
+      <w:pPr>
+        <w:tabs>
+          <w:tab w:val="num" w:pos="2160"/>
+        </w:tabs>
+        <w:ind w:left="2160" w:hanging="360"/>
+      </w:pPr>
+      <w:rPr>
+        <w:rFonts w:ascii="Wingdings" w:hAnsi="Wingdings" w:hint="default"/>
+        <w:sz w:val="20"/>
+      </w:rPr>
+    </w:lvl>
+    <w:lvl w:ilvl="3" w:tentative="1">
+      <w:start w:val="1"/>
+      <w:numFmt w:val="bullet"/>
+      <w:lvlText w:val=""/>
+      <w:lvlJc w:val="left"/>
+      <w:pPr>
+        <w:tabs>
+          <w:tab w:val="num" w:pos="2880"/>
+        </w:tabs>
+        <w:ind w:left="2880" w:hanging="360"/>
+      </w:pPr>
+      <w:rPr>
+        <w:rFonts w:ascii="Wingdings" w:hAnsi="Wingdings" w:hint="default"/>
+        <w:sz w:val="20"/>
+      </w:rPr>
+    </w:lvl>
+    <w:lvl w:ilvl="4" w:tentative="1">
+      <w:start w:val="1"/>
+      <w:numFmt w:val="bullet"/>
+      <w:lvlText w:val=""/>
+      <w:lvlJc w:val="left"/>
+      <w:pPr>
+        <w:tabs>
+          <w:tab w:val="num" w:pos="3600"/>
+        </w:tabs>
+        <w:ind w:left="3600" w:hanging="360"/>
+      </w:pPr>
+      <w:rPr>
+        <w:rFonts w:ascii="Wingdings" w:hAnsi="Wingdings" w:hint="default"/>
+        <w:sz w:val="20"/>
+      </w:rPr>
+    </w:lvl>
+    <w:lvl w:ilvl="5" w:tentative="1">
+      <w:start w:val="1"/>
+      <w:numFmt w:val="bullet"/>
+      <w:lvlText w:val=""/>
+      <w:lvlJc w:val="left"/>
+      <w:pPr>
+        <w:tabs>
+          <w:tab w:val="num" w:pos="4320"/>
+        </w:tabs>
+        <w:ind w:left="4320" w:hanging="360"/>
+      </w:pPr>
+      <w:rPr>
+        <w:rFonts w:ascii="Wingdings" w:hAnsi="Wingdings" w:hint="default"/>
+        <w:sz w:val="20"/>
+      </w:rPr>
+    </w:lvl>
+    <w:lvl w:ilvl="6" w:tentative="1">
+      <w:start w:val="1"/>
+      <w:numFmt w:val="bullet"/>
+      <w:lvlText w:val=""/>
+      <w:lvlJc w:val="left"/>
+      <w:pPr>
+        <w:tabs>
+          <w:tab w:val="num" w:pos="5040"/>
+        </w:tabs>
+        <w:ind w:left="5040" w:hanging="360"/>
+      </w:pPr>
+      <w:rPr>
+        <w:rFonts w:ascii="Wingdings" w:hAnsi="Wingdings" w:hint="default"/>
+        <w:sz w:val="20"/>
+      </w:rPr>
+    </w:lvl>
+    <w:lvl w:ilvl="7" w:tentative="1">
+      <w:start w:val="1"/>
+      <w:numFmt w:val="bullet"/>
+      <w:lvlText w:val=""/>
+      <w:lvlJc w:val="left"/>
+      <w:pPr>
+        <w:tabs>
+          <w:tab w:val="num" w:pos="5760"/>
+        </w:tabs>
+        <w:ind w:left="5760" w:hanging="360"/>
+      </w:pPr>
+      <w:rPr>
+        <w:rFonts w:ascii="Wingdings" w:hAnsi="Wingdings" w:hint="default"/>
+        <w:sz w:val="20"/>
+      </w:rPr>
+    </w:lvl>
+    <w:lvl w:ilvl="8" w:tentative="1">
+      <w:start w:val="1"/>
+      <w:numFmt w:val="bullet"/>
+      <w:lvlText w:val=""/>
+      <w:lvlJc w:val="left"/>
+      <w:pPr>
+        <w:tabs>
+          <w:tab w:val="num" w:pos="6480"/>
+        </w:tabs>
+        <w:ind w:left="6480" w:hanging="360"/>
+      </w:pPr>
+      <w:rPr>
+        <w:rFonts w:ascii="Wingdings" w:hAnsi="Wingdings" w:hint="default"/>
+        <w:sz w:val="20"/>
+      </w:rPr>
+    </w:lvl>
+  </w:abstractNum>
+  <w:abstractNum w:abstractNumId="1" w15:restartNumberingAfterBreak="0">
     <w:nsid w:val="49FB6072"/>
     <w:multiLevelType w:val="multilevel"/>
     <w:tmpl w:val="608C4F18"/>
@@ -3632,7 +4285,156 @@
       </w:pPr>
     </w:lvl>
   </w:abstractNum>
-  <w:abstractNum w:abstractNumId="1" w15:restartNumberingAfterBreak="0">
+  <w:abstractNum w:abstractNumId="2" w15:restartNumberingAfterBreak="0">
+    <w:nsid w:val="5C295E76"/>
+    <w:multiLevelType w:val="multilevel"/>
+    <w:tmpl w:val="228221B2"/>
+    <w:lvl w:ilvl="0">
+      <w:start w:val="1"/>
+      <w:numFmt w:val="bullet"/>
+      <w:lvlText w:val=""/>
+      <w:lvlJc w:val="left"/>
+      <w:pPr>
+        <w:tabs>
+          <w:tab w:val="num" w:pos="720"/>
+        </w:tabs>
+        <w:ind w:left="720" w:hanging="360"/>
+      </w:pPr>
+      <w:rPr>
+        <w:rFonts w:ascii="Symbol" w:hAnsi="Symbol" w:hint="default"/>
+        <w:sz w:val="20"/>
+      </w:rPr>
+    </w:lvl>
+    <w:lvl w:ilvl="1" w:tentative="1">
+      <w:start w:val="1"/>
+      <w:numFmt w:val="bullet"/>
+      <w:lvlText w:val="o"/>
+      <w:lvlJc w:val="left"/>
+      <w:pPr>
+        <w:tabs>
+          <w:tab w:val="num" w:pos="1440"/>
+        </w:tabs>
+        <w:ind w:left="1440" w:hanging="360"/>
+      </w:pPr>
+      <w:rPr>
+        <w:rFonts w:ascii="Courier New" w:hAnsi="Courier New" w:hint="default"/>
+        <w:sz w:val="20"/>
+      </w:rPr>
+    </w:lvl>
+    <w:lvl w:ilvl="2" w:tentative="1">
+      <w:start w:val="1"/>
+      <w:numFmt w:val="bullet"/>
+      <w:lvlText w:val=""/>
+      <w:lvlJc w:val="left"/>
+      <w:pPr>
+        <w:tabs>
+          <w:tab w:val="num" w:pos="2160"/>
+        </w:tabs>
+        <w:ind w:left="2160" w:hanging="360"/>
+      </w:pPr>
+      <w:rPr>
+        <w:rFonts w:ascii="Wingdings" w:hAnsi="Wingdings" w:hint="default"/>
+        <w:sz w:val="20"/>
+      </w:rPr>
+    </w:lvl>
+    <w:lvl w:ilvl="3" w:tentative="1">
+      <w:start w:val="1"/>
+      <w:numFmt w:val="bullet"/>
+      <w:lvlText w:val=""/>
+      <w:lvlJc w:val="left"/>
+      <w:pPr>
+        <w:tabs>
+          <w:tab w:val="num" w:pos="2880"/>
+        </w:tabs>
+        <w:ind w:left="2880" w:hanging="360"/>
+      </w:pPr>
+      <w:rPr>
+        <w:rFonts w:ascii="Wingdings" w:hAnsi="Wingdings" w:hint="default"/>
+        <w:sz w:val="20"/>
+      </w:rPr>
+    </w:lvl>
+    <w:lvl w:ilvl="4" w:tentative="1">
+      <w:start w:val="1"/>
+      <w:numFmt w:val="bullet"/>
+      <w:lvlText w:val=""/>
+      <w:lvlJc w:val="left"/>
+      <w:pPr>
+        <w:tabs>
+          <w:tab w:val="num" w:pos="3600"/>
+        </w:tabs>
+        <w:ind w:left="3600" w:hanging="360"/>
+      </w:pPr>
+      <w:rPr>
+        <w:rFonts w:ascii="Wingdings" w:hAnsi="Wingdings" w:hint="default"/>
+        <w:sz w:val="20"/>
+      </w:rPr>
+    </w:lvl>
+    <w:lvl w:ilvl="5" w:tentative="1">
+      <w:start w:val="1"/>
+      <w:numFmt w:val="bullet"/>
+      <w:lvlText w:val=""/>
+      <w:lvlJc w:val="left"/>
+      <w:pPr>
+        <w:tabs>
+          <w:tab w:val="num" w:pos="4320"/>
+        </w:tabs>
+        <w:ind w:left="4320" w:hanging="360"/>
+      </w:pPr>
+      <w:rPr>
+        <w:rFonts w:ascii="Wingdings" w:hAnsi="Wingdings" w:hint="default"/>
+        <w:sz w:val="20"/>
+      </w:rPr>
+    </w:lvl>
+    <w:lvl w:ilvl="6" w:tentative="1">
+      <w:start w:val="1"/>
+      <w:numFmt w:val="bullet"/>
+      <w:lvlText w:val=""/>
+      <w:lvlJc w:val="left"/>
+      <w:pPr>
+        <w:tabs>
+          <w:tab w:val="num" w:pos="5040"/>
+        </w:tabs>
+        <w:ind w:left="5040" w:hanging="360"/>
+      </w:pPr>
+      <w:rPr>
+        <w:rFonts w:ascii="Wingdings" w:hAnsi="Wingdings" w:hint="default"/>
+        <w:sz w:val="20"/>
+      </w:rPr>
+    </w:lvl>
+    <w:lvl w:ilvl="7" w:tentative="1">
+      <w:start w:val="1"/>
+      <w:numFmt w:val="bullet"/>
+      <w:lvlText w:val=""/>
+      <w:lvlJc w:val="left"/>
+      <w:pPr>
+        <w:tabs>
+          <w:tab w:val="num" w:pos="5760"/>
+        </w:tabs>
+        <w:ind w:left="5760" w:hanging="360"/>
+      </w:pPr>
+      <w:rPr>
+        <w:rFonts w:ascii="Wingdings" w:hAnsi="Wingdings" w:hint="default"/>
+        <w:sz w:val="20"/>
+      </w:rPr>
+    </w:lvl>
+    <w:lvl w:ilvl="8" w:tentative="1">
+      <w:start w:val="1"/>
+      <w:numFmt w:val="bullet"/>
+      <w:lvlText w:val=""/>
+      <w:lvlJc w:val="left"/>
+      <w:pPr>
+        <w:tabs>
+          <w:tab w:val="num" w:pos="6480"/>
+        </w:tabs>
+        <w:ind w:left="6480" w:hanging="360"/>
+      </w:pPr>
+      <w:rPr>
+        <w:rFonts w:ascii="Wingdings" w:hAnsi="Wingdings" w:hint="default"/>
+        <w:sz w:val="20"/>
+      </w:rPr>
+    </w:lvl>
+  </w:abstractNum>
+  <w:abstractNum w:abstractNumId="3" w15:restartNumberingAfterBreak="0">
     <w:nsid w:val="7E461A8C"/>
     <w:multiLevelType w:val="multilevel"/>
     <w:tmpl w:val="388E0AC8"/>
@@ -3746,9 +4548,15 @@
     </w:lvl>
   </w:abstractNum>
   <w:num w:numId="1" w16cid:durableId="2123650747">
+    <w:abstractNumId w:val="3"/>
+  </w:num>
+  <w:num w:numId="2" w16cid:durableId="1610426746">
     <w:abstractNumId w:val="1"/>
   </w:num>
-  <w:num w:numId="2" w16cid:durableId="1610426746">
+  <w:num w:numId="3" w16cid:durableId="270623311">
+    <w:abstractNumId w:val="2"/>
+  </w:num>
+  <w:num w:numId="4" w16cid:durableId="1857578100">
     <w:abstractNumId w:val="0"/>
   </w:num>
 </w:numbering>
@@ -4357,7 +5165,6 @@
   <w:style w:type="character" w:default="1" w:styleId="DefaultParagraphFont">
     <w:name w:val="Default Paragraph Font"/>
     <w:uiPriority w:val="1"/>
-    <w:semiHidden/>
     <w:unhideWhenUsed/>
   </w:style>
   <w:style w:type="table" w:default="1" w:styleId="TableNormal">

</xml_diff>

<commit_message>
Update DSA Notes with a new question on Binomial Coefficient and modify workspace settings to reflect changes in the document.
</commit_message>
<xml_diff>
--- a/Notes/DSA Notes.docx
+++ b/Notes/DSA Notes.docx
@@ -3674,6 +3674,7 @@
         <w:rPr>
           <w:b/>
           <w:bCs/>
+          <w:noProof/>
         </w:rPr>
         <w:drawing>
           <wp:inline distT="0" distB="0" distL="0" distR="0" wp14:anchorId="4E5C5314" wp14:editId="46EBF444">
@@ -3726,7 +3727,7 @@
     <w:p>
       <w:r>
         <w:pict w14:anchorId="2BA9D92B">
-          <v:rect id="_x0000_i1050" style="width:0;height:1.5pt" o:hralign="center" o:hrstd="t" o:hr="t" fillcolor="#a0a0a0" stroked="f"/>
+          <v:rect id="_x0000_i1025" style="width:0;height:1.5pt" o:hralign="center" o:hrstd="t" o:hr="t" fillcolor="#a0a0a0" stroked="f"/>
         </w:pict>
       </w:r>
     </w:p>
@@ -3861,6 +3862,7 @@
         <w:rPr>
           <w:b/>
           <w:bCs/>
+          <w:noProof/>
         </w:rPr>
         <w:drawing>
           <wp:inline distT="0" distB="0" distL="0" distR="0" wp14:anchorId="7F6CDBDE" wp14:editId="28E4BC63">
@@ -3922,6 +3924,9 @@
     </w:p>
     <w:p>
       <w:r>
+        <w:rPr>
+          <w:noProof/>
+        </w:rPr>
         <w:drawing>
           <wp:inline distT="0" distB="0" distL="0" distR="0" wp14:anchorId="54D01AD9" wp14:editId="73631111">
             <wp:extent cx="5731510" cy="3064510"/>
@@ -3960,6 +3965,139 @@
       </w:r>
     </w:p>
     <w:p/>
+    <w:p>
+      <w:pPr>
+        <w:rPr>
+          <w:b/>
+          <w:bCs/>
+        </w:rPr>
+      </w:pPr>
+      <w:r>
+        <w:rPr>
+          <w:b/>
+          <w:bCs/>
+        </w:rPr>
+        <w:lastRenderedPageBreak/>
+        <w:t>Q. Binomial Coefficient</w:t>
+      </w:r>
+    </w:p>
+    <w:p>
+      <w:r>
+        <w:drawing>
+          <wp:inline distT="0" distB="0" distL="0" distR="0" wp14:anchorId="7985814F" wp14:editId="478C6CBB">
+            <wp:extent cx="4579620" cy="2035105"/>
+            <wp:effectExtent l="0" t="0" r="0" b="3810"/>
+            <wp:docPr id="1755469285" name="Picture 1"/>
+            <wp:cNvGraphicFramePr>
+              <a:graphicFrameLocks xmlns:a="http://schemas.openxmlformats.org/drawingml/2006/main" noChangeAspect="1"/>
+            </wp:cNvGraphicFramePr>
+            <a:graphic xmlns:a="http://schemas.openxmlformats.org/drawingml/2006/main">
+              <a:graphicData uri="http://schemas.openxmlformats.org/drawingml/2006/picture">
+                <pic:pic xmlns:pic="http://schemas.openxmlformats.org/drawingml/2006/picture">
+                  <pic:nvPicPr>
+                    <pic:cNvPr id="1755469285" name=""/>
+                    <pic:cNvPicPr/>
+                  </pic:nvPicPr>
+                  <pic:blipFill>
+                    <a:blip r:embed="rId21"/>
+                    <a:stretch>
+                      <a:fillRect/>
+                    </a:stretch>
+                  </pic:blipFill>
+                  <pic:spPr>
+                    <a:xfrm>
+                      <a:off x="0" y="0"/>
+                      <a:ext cx="4601170" cy="2044682"/>
+                    </a:xfrm>
+                    <a:prstGeom prst="rect">
+                      <a:avLst/>
+                    </a:prstGeom>
+                  </pic:spPr>
+                </pic:pic>
+              </a:graphicData>
+            </a:graphic>
+          </wp:inline>
+        </w:drawing>
+      </w:r>
+    </w:p>
+    <w:p>
+      <w:r>
+        <w:drawing>
+          <wp:inline distT="0" distB="0" distL="0" distR="0" wp14:anchorId="78544AE1" wp14:editId="58922875">
+            <wp:extent cx="4617720" cy="1150593"/>
+            <wp:effectExtent l="0" t="0" r="0" b="0"/>
+            <wp:docPr id="1523775800" name="Picture 1"/>
+            <wp:cNvGraphicFramePr>
+              <a:graphicFrameLocks xmlns:a="http://schemas.openxmlformats.org/drawingml/2006/main" noChangeAspect="1"/>
+            </wp:cNvGraphicFramePr>
+            <a:graphic xmlns:a="http://schemas.openxmlformats.org/drawingml/2006/main">
+              <a:graphicData uri="http://schemas.openxmlformats.org/drawingml/2006/picture">
+                <pic:pic xmlns:pic="http://schemas.openxmlformats.org/drawingml/2006/picture">
+                  <pic:nvPicPr>
+                    <pic:cNvPr id="1523775800" name=""/>
+                    <pic:cNvPicPr/>
+                  </pic:nvPicPr>
+                  <pic:blipFill>
+                    <a:blip r:embed="rId22"/>
+                    <a:stretch>
+                      <a:fillRect/>
+                    </a:stretch>
+                  </pic:blipFill>
+                  <pic:spPr>
+                    <a:xfrm>
+                      <a:off x="0" y="0"/>
+                      <a:ext cx="4655265" cy="1159948"/>
+                    </a:xfrm>
+                    <a:prstGeom prst="rect">
+                      <a:avLst/>
+                    </a:prstGeom>
+                  </pic:spPr>
+                </pic:pic>
+              </a:graphicData>
+            </a:graphic>
+          </wp:inline>
+        </w:drawing>
+      </w:r>
+    </w:p>
+    <w:p>
+      <w:r>
+        <w:drawing>
+          <wp:inline distT="0" distB="0" distL="0" distR="0" wp14:anchorId="5FBA65FF" wp14:editId="0DB5017F">
+            <wp:extent cx="3451860" cy="5139826"/>
+            <wp:effectExtent l="0" t="0" r="0" b="3810"/>
+            <wp:docPr id="1996772972" name="Picture 1" descr="A screen shot of a computer program&#10;&#10;AI-generated content may be incorrect."/>
+            <wp:cNvGraphicFramePr>
+              <a:graphicFrameLocks xmlns:a="http://schemas.openxmlformats.org/drawingml/2006/main" noChangeAspect="1"/>
+            </wp:cNvGraphicFramePr>
+            <a:graphic xmlns:a="http://schemas.openxmlformats.org/drawingml/2006/main">
+              <a:graphicData uri="http://schemas.openxmlformats.org/drawingml/2006/picture">
+                <pic:pic xmlns:pic="http://schemas.openxmlformats.org/drawingml/2006/picture">
+                  <pic:nvPicPr>
+                    <pic:cNvPr id="1996772972" name="Picture 1" descr="A screen shot of a computer program&#10;&#10;AI-generated content may be incorrect."/>
+                    <pic:cNvPicPr/>
+                  </pic:nvPicPr>
+                  <pic:blipFill>
+                    <a:blip r:embed="rId23"/>
+                    <a:stretch>
+                      <a:fillRect/>
+                    </a:stretch>
+                  </pic:blipFill>
+                  <pic:spPr>
+                    <a:xfrm>
+                      <a:off x="0" y="0"/>
+                      <a:ext cx="3465245" cy="5159757"/>
+                    </a:xfrm>
+                    <a:prstGeom prst="rect">
+                      <a:avLst/>
+                    </a:prstGeom>
+                  </pic:spPr>
+                </pic:pic>
+              </a:graphicData>
+            </a:graphic>
+          </wp:inline>
+        </w:drawing>
+      </w:r>
+    </w:p>
     <w:p/>
     <w:sectPr>
       <w:pgSz w:w="11906" w:h="16838"/>
@@ -5165,6 +5303,7 @@
   <w:style w:type="character" w:default="1" w:styleId="DefaultParagraphFont">
     <w:name w:val="Default Paragraph Font"/>
     <w:uiPriority w:val="1"/>
+    <w:semiHidden/>
     <w:unhideWhenUsed/>
   </w:style>
   <w:style w:type="table" w:default="1" w:styleId="TableNormal">

</xml_diff>

<commit_message>
Function Overloading using Parameters
</commit_message>
<xml_diff>
--- a/Notes/DSA Notes.docx
+++ b/Notes/DSA Notes.docx
@@ -4098,7 +4098,321 @@
         </w:drawing>
       </w:r>
     </w:p>
-    <w:p/>
+    <w:p>
+      <w:pPr>
+        <w:rPr>
+          <w:b/>
+          <w:bCs/>
+        </w:rPr>
+      </w:pPr>
+      <w:r>
+        <w:rPr>
+          <w:b/>
+          <w:bCs/>
+        </w:rPr>
+        <w:lastRenderedPageBreak/>
+        <w:t>Q. Methods</w:t>
+      </w:r>
+    </w:p>
+    <w:p>
+      <w:r>
+        <w:drawing>
+          <wp:inline distT="0" distB="0" distL="0" distR="0" wp14:anchorId="5CAFA0A7" wp14:editId="58B305E7">
+            <wp:extent cx="3170195" cy="2530059"/>
+            <wp:effectExtent l="0" t="0" r="0" b="3810"/>
+            <wp:docPr id="794971431" name="Picture 1"/>
+            <wp:cNvGraphicFramePr>
+              <a:graphicFrameLocks xmlns:a="http://schemas.openxmlformats.org/drawingml/2006/main" noChangeAspect="1"/>
+            </wp:cNvGraphicFramePr>
+            <a:graphic xmlns:a="http://schemas.openxmlformats.org/drawingml/2006/main">
+              <a:graphicData uri="http://schemas.openxmlformats.org/drawingml/2006/picture">
+                <pic:pic xmlns:pic="http://schemas.openxmlformats.org/drawingml/2006/picture">
+                  <pic:nvPicPr>
+                    <pic:cNvPr id="794971431" name=""/>
+                    <pic:cNvPicPr/>
+                  </pic:nvPicPr>
+                  <pic:blipFill>
+                    <a:blip r:embed="rId24"/>
+                    <a:stretch>
+                      <a:fillRect/>
+                    </a:stretch>
+                  </pic:blipFill>
+                  <pic:spPr>
+                    <a:xfrm>
+                      <a:off x="0" y="0"/>
+                      <a:ext cx="3170195" cy="2530059"/>
+                    </a:xfrm>
+                    <a:prstGeom prst="rect">
+                      <a:avLst/>
+                    </a:prstGeom>
+                  </pic:spPr>
+                </pic:pic>
+              </a:graphicData>
+            </a:graphic>
+          </wp:inline>
+        </w:drawing>
+      </w:r>
+    </w:p>
+    <w:p>
+      <w:r>
+        <w:rPr>
+          <w:b/>
+          <w:bCs/>
+        </w:rPr>
+        <w:t xml:space="preserve">Q. Function </w:t>
+      </w:r>
+      <w:proofErr w:type="gramStart"/>
+      <w:r>
+        <w:rPr>
+          <w:b/>
+          <w:bCs/>
+        </w:rPr>
+        <w:t>Overloading</w:t>
+      </w:r>
+      <w:r>
+        <w:rPr>
+          <w:b/>
+          <w:bCs/>
+        </w:rPr>
+        <w:t xml:space="preserve"> :</w:t>
+      </w:r>
+      <w:proofErr w:type="gramEnd"/>
+      <w:r>
+        <w:rPr>
+          <w:b/>
+          <w:bCs/>
+        </w:rPr>
+        <w:t xml:space="preserve"> </w:t>
+      </w:r>
+      <w:r>
+        <w:t xml:space="preserve">It </w:t>
+      </w:r>
+      <w:proofErr w:type="gramStart"/>
+      <w:r>
+        <w:t>depend</w:t>
+      </w:r>
+      <w:proofErr w:type="gramEnd"/>
+      <w:r>
+        <w:t xml:space="preserve"> on </w:t>
+      </w:r>
+      <w:proofErr w:type="gramStart"/>
+      <w:r>
+        <w:t>parameter ,</w:t>
+      </w:r>
+      <w:proofErr w:type="gramEnd"/>
+      <w:r>
+        <w:t xml:space="preserve"> not return type</w:t>
+      </w:r>
+    </w:p>
+    <w:p>
+      <w:pPr>
+        <w:rPr>
+          <w:b/>
+          <w:bCs/>
+        </w:rPr>
+      </w:pPr>
+      <w:r>
+        <w:rPr>
+          <w:b/>
+          <w:bCs/>
+        </w:rPr>
+        <w:drawing>
+          <wp:inline distT="0" distB="0" distL="0" distR="0" wp14:anchorId="20C1698F" wp14:editId="5B85894A">
+            <wp:extent cx="4613843" cy="2506980"/>
+            <wp:effectExtent l="0" t="0" r="0" b="7620"/>
+            <wp:docPr id="706317743" name="Picture 1" descr="A black board with white text and words&#10;&#10;AI-generated content may be incorrect."/>
+            <wp:cNvGraphicFramePr>
+              <a:graphicFrameLocks xmlns:a="http://schemas.openxmlformats.org/drawingml/2006/main" noChangeAspect="1"/>
+            </wp:cNvGraphicFramePr>
+            <a:graphic xmlns:a="http://schemas.openxmlformats.org/drawingml/2006/main">
+              <a:graphicData uri="http://schemas.openxmlformats.org/drawingml/2006/picture">
+                <pic:pic xmlns:pic="http://schemas.openxmlformats.org/drawingml/2006/picture">
+                  <pic:nvPicPr>
+                    <pic:cNvPr id="706317743" name="Picture 1" descr="A black board with white text and words&#10;&#10;AI-generated content may be incorrect."/>
+                    <pic:cNvPicPr/>
+                  </pic:nvPicPr>
+                  <pic:blipFill>
+                    <a:blip r:embed="rId25"/>
+                    <a:stretch>
+                      <a:fillRect/>
+                    </a:stretch>
+                  </pic:blipFill>
+                  <pic:spPr>
+                    <a:xfrm>
+                      <a:off x="0" y="0"/>
+                      <a:ext cx="4624435" cy="2512735"/>
+                    </a:xfrm>
+                    <a:prstGeom prst="rect">
+                      <a:avLst/>
+                    </a:prstGeom>
+                  </pic:spPr>
+                </pic:pic>
+              </a:graphicData>
+            </a:graphic>
+          </wp:inline>
+        </w:drawing>
+      </w:r>
+    </w:p>
+    <w:p>
+      <w:pPr>
+        <w:rPr>
+          <w:b/>
+          <w:bCs/>
+        </w:rPr>
+      </w:pPr>
+      <w:r>
+        <w:rPr>
+          <w:b/>
+          <w:bCs/>
+        </w:rPr>
+        <w:drawing>
+          <wp:inline distT="0" distB="0" distL="0" distR="0" wp14:anchorId="05640AC9" wp14:editId="7B2F19B0">
+            <wp:extent cx="5731510" cy="2764155"/>
+            <wp:effectExtent l="0" t="0" r="2540" b="0"/>
+            <wp:docPr id="908750759" name="Picture 1" descr="A blackboard with white text and symbols&#10;&#10;AI-generated content may be incorrect."/>
+            <wp:cNvGraphicFramePr>
+              <a:graphicFrameLocks xmlns:a="http://schemas.openxmlformats.org/drawingml/2006/main" noChangeAspect="1"/>
+            </wp:cNvGraphicFramePr>
+            <a:graphic xmlns:a="http://schemas.openxmlformats.org/drawingml/2006/main">
+              <a:graphicData uri="http://schemas.openxmlformats.org/drawingml/2006/picture">
+                <pic:pic xmlns:pic="http://schemas.openxmlformats.org/drawingml/2006/picture">
+                  <pic:nvPicPr>
+                    <pic:cNvPr id="908750759" name="Picture 1" descr="A blackboard with white text and symbols&#10;&#10;AI-generated content may be incorrect."/>
+                    <pic:cNvPicPr/>
+                  </pic:nvPicPr>
+                  <pic:blipFill>
+                    <a:blip r:embed="rId26"/>
+                    <a:stretch>
+                      <a:fillRect/>
+                    </a:stretch>
+                  </pic:blipFill>
+                  <pic:spPr>
+                    <a:xfrm>
+                      <a:off x="0" y="0"/>
+                      <a:ext cx="5731510" cy="2764155"/>
+                    </a:xfrm>
+                    <a:prstGeom prst="rect">
+                      <a:avLst/>
+                    </a:prstGeom>
+                  </pic:spPr>
+                </pic:pic>
+              </a:graphicData>
+            </a:graphic>
+          </wp:inline>
+        </w:drawing>
+      </w:r>
+    </w:p>
+    <w:p>
+      <w:pPr>
+        <w:rPr>
+          <w:b/>
+          <w:bCs/>
+          <w:lang w:val="en-US"/>
+        </w:rPr>
+      </w:pPr>
+      <w:r>
+        <w:rPr>
+          <w:b/>
+          <w:bCs/>
+          <w:lang w:val="en-US"/>
+        </w:rPr>
+        <w:lastRenderedPageBreak/>
+        <w:drawing>
+          <wp:inline distT="0" distB="0" distL="0" distR="0" wp14:anchorId="6A0D1A1E" wp14:editId="5E484E02">
+            <wp:extent cx="3604572" cy="2720576"/>
+            <wp:effectExtent l="0" t="0" r="0" b="3810"/>
+            <wp:docPr id="1822875834" name="Picture 1" descr="A screen shot of a computer program&#10;&#10;AI-generated content may be incorrect."/>
+            <wp:cNvGraphicFramePr>
+              <a:graphicFrameLocks xmlns:a="http://schemas.openxmlformats.org/drawingml/2006/main" noChangeAspect="1"/>
+            </wp:cNvGraphicFramePr>
+            <a:graphic xmlns:a="http://schemas.openxmlformats.org/drawingml/2006/main">
+              <a:graphicData uri="http://schemas.openxmlformats.org/drawingml/2006/picture">
+                <pic:pic xmlns:pic="http://schemas.openxmlformats.org/drawingml/2006/picture">
+                  <pic:nvPicPr>
+                    <pic:cNvPr id="1822875834" name="Picture 1" descr="A screen shot of a computer program&#10;&#10;AI-generated content may be incorrect."/>
+                    <pic:cNvPicPr/>
+                  </pic:nvPicPr>
+                  <pic:blipFill>
+                    <a:blip r:embed="rId27"/>
+                    <a:stretch>
+                      <a:fillRect/>
+                    </a:stretch>
+                  </pic:blipFill>
+                  <pic:spPr>
+                    <a:xfrm>
+                      <a:off x="0" y="0"/>
+                      <a:ext cx="3604572" cy="2720576"/>
+                    </a:xfrm>
+                    <a:prstGeom prst="rect">
+                      <a:avLst/>
+                    </a:prstGeom>
+                  </pic:spPr>
+                </pic:pic>
+              </a:graphicData>
+            </a:graphic>
+          </wp:inline>
+        </w:drawing>
+      </w:r>
+      <w:r>
+        <w:rPr>
+          <w:b/>
+          <w:bCs/>
+          <w:lang w:val="en-US"/>
+        </w:rPr>
+        <w:t xml:space="preserve">  </w:t>
+      </w:r>
+      <w:r>
+        <w:rPr>
+          <w:b/>
+          <w:bCs/>
+          <w:lang w:val="en-US"/>
+        </w:rPr>
+        <w:drawing>
+          <wp:inline distT="0" distB="0" distL="0" distR="0" wp14:anchorId="4F4779A1" wp14:editId="4862F2A1">
+            <wp:extent cx="416195" cy="563880"/>
+            <wp:effectExtent l="0" t="0" r="3175" b="7620"/>
+            <wp:docPr id="1175854086" name="Picture 1"/>
+            <wp:cNvGraphicFramePr>
+              <a:graphicFrameLocks xmlns:a="http://schemas.openxmlformats.org/drawingml/2006/main" noChangeAspect="1"/>
+            </wp:cNvGraphicFramePr>
+            <a:graphic xmlns:a="http://schemas.openxmlformats.org/drawingml/2006/main">
+              <a:graphicData uri="http://schemas.openxmlformats.org/drawingml/2006/picture">
+                <pic:pic xmlns:pic="http://schemas.openxmlformats.org/drawingml/2006/picture">
+                  <pic:nvPicPr>
+                    <pic:cNvPr id="1175854086" name=""/>
+                    <pic:cNvPicPr/>
+                  </pic:nvPicPr>
+                  <pic:blipFill>
+                    <a:blip r:embed="rId28"/>
+                    <a:stretch>
+                      <a:fillRect/>
+                    </a:stretch>
+                  </pic:blipFill>
+                  <pic:spPr>
+                    <a:xfrm>
+                      <a:off x="0" y="0"/>
+                      <a:ext cx="422351" cy="572220"/>
+                    </a:xfrm>
+                    <a:prstGeom prst="rect">
+                      <a:avLst/>
+                    </a:prstGeom>
+                  </pic:spPr>
+                </pic:pic>
+              </a:graphicData>
+            </a:graphic>
+          </wp:inline>
+        </w:drawing>
+      </w:r>
+    </w:p>
+    <w:p>
+      <w:pPr>
+        <w:rPr>
+          <w:b/>
+          <w:bCs/>
+          <w:lang w:val="en-US"/>
+        </w:rPr>
+      </w:pPr>
+    </w:p>
     <w:sectPr>
       <w:pgSz w:w="11906" w:h="16838"/>
       <w:pgMar w:top="1440" w:right="1440" w:bottom="1440" w:left="1440" w:header="708" w:footer="708" w:gutter="0"/>

</xml_diff>

<commit_message>
Overloading using Data Types
</commit_message>
<xml_diff>
--- a/Notes/DSA Notes.docx
+++ b/Notes/DSA Notes.docx
@@ -4265,10 +4265,41 @@
           <w:b/>
           <w:bCs/>
         </w:rPr>
+        <w:t xml:space="preserve">Using </w:t>
+      </w:r>
+      <w:proofErr w:type="gramStart"/>
+      <w:r>
+        <w:rPr>
+          <w:b/>
+          <w:bCs/>
+        </w:rPr>
+        <w:t>parameter’s</w:t>
+      </w:r>
+      <w:proofErr w:type="gramEnd"/>
+      <w:r>
+        <w:rPr>
+          <w:b/>
+          <w:bCs/>
+        </w:rPr>
+        <w:t>:</w:t>
+      </w:r>
+    </w:p>
+    <w:p>
+      <w:pPr>
+        <w:rPr>
+          <w:b/>
+          <w:bCs/>
+        </w:rPr>
+      </w:pPr>
+      <w:r>
+        <w:rPr>
+          <w:b/>
+          <w:bCs/>
+        </w:rPr>
         <w:drawing>
-          <wp:inline distT="0" distB="0" distL="0" distR="0" wp14:anchorId="05640AC9" wp14:editId="7B2F19B0">
-            <wp:extent cx="5731510" cy="2764155"/>
-            <wp:effectExtent l="0" t="0" r="2540" b="0"/>
+          <wp:inline distT="0" distB="0" distL="0" distR="0" wp14:anchorId="05640AC9" wp14:editId="33D9D1EA">
+            <wp:extent cx="4866451" cy="2346960"/>
+            <wp:effectExtent l="0" t="0" r="0" b="0"/>
             <wp:docPr id="908750759" name="Picture 1" descr="A blackboard with white text and symbols&#10;&#10;AI-generated content may be incorrect."/>
             <wp:cNvGraphicFramePr>
               <a:graphicFrameLocks xmlns:a="http://schemas.openxmlformats.org/drawingml/2006/main" noChangeAspect="1"/>
@@ -4289,7 +4320,7 @@
                   <pic:spPr>
                     <a:xfrm>
                       <a:off x="0" y="0"/>
-                      <a:ext cx="5731510" cy="2764155"/>
+                      <a:ext cx="4882899" cy="2354892"/>
                     </a:xfrm>
                     <a:prstGeom prst="rect">
                       <a:avLst/>
@@ -4403,6 +4434,202 @@
           </wp:inline>
         </w:drawing>
       </w:r>
+    </w:p>
+    <w:p>
+      <w:pPr>
+        <w:rPr>
+          <w:b/>
+          <w:bCs/>
+          <w:lang w:val="en-US"/>
+        </w:rPr>
+      </w:pPr>
+      <w:r>
+        <w:rPr>
+          <w:b/>
+          <w:bCs/>
+          <w:lang w:val="en-US"/>
+        </w:rPr>
+        <w:t xml:space="preserve">Using </w:t>
+      </w:r>
+      <w:proofErr w:type="gramStart"/>
+      <w:r>
+        <w:rPr>
+          <w:b/>
+          <w:bCs/>
+          <w:lang w:val="en-US"/>
+        </w:rPr>
+        <w:t>datatypes</w:t>
+      </w:r>
+      <w:proofErr w:type="gramEnd"/>
+      <w:r>
+        <w:rPr>
+          <w:b/>
+          <w:bCs/>
+          <w:lang w:val="en-US"/>
+        </w:rPr>
+        <w:t>:</w:t>
+      </w:r>
+    </w:p>
+    <w:p>
+      <w:pPr>
+        <w:rPr>
+          <w:b/>
+          <w:bCs/>
+          <w:lang w:val="en-US"/>
+        </w:rPr>
+      </w:pPr>
+      <w:r>
+        <w:rPr>
+          <w:b/>
+          <w:bCs/>
+          <w:lang w:val="en-US"/>
+        </w:rPr>
+        <w:drawing>
+          <wp:inline distT="0" distB="0" distL="0" distR="0" wp14:anchorId="2FE15C83" wp14:editId="3B46D949">
+            <wp:extent cx="4032701" cy="2377440"/>
+            <wp:effectExtent l="0" t="0" r="6350" b="3810"/>
+            <wp:docPr id="1510195042" name="Picture 1" descr="A blackboard with white text&#10;&#10;AI-generated content may be incorrect."/>
+            <wp:cNvGraphicFramePr>
+              <a:graphicFrameLocks xmlns:a="http://schemas.openxmlformats.org/drawingml/2006/main" noChangeAspect="1"/>
+            </wp:cNvGraphicFramePr>
+            <a:graphic xmlns:a="http://schemas.openxmlformats.org/drawingml/2006/main">
+              <a:graphicData uri="http://schemas.openxmlformats.org/drawingml/2006/picture">
+                <pic:pic xmlns:pic="http://schemas.openxmlformats.org/drawingml/2006/picture">
+                  <pic:nvPicPr>
+                    <pic:cNvPr id="1510195042" name="Picture 1" descr="A blackboard with white text&#10;&#10;AI-generated content may be incorrect."/>
+                    <pic:cNvPicPr/>
+                  </pic:nvPicPr>
+                  <pic:blipFill>
+                    <a:blip r:embed="rId29"/>
+                    <a:stretch>
+                      <a:fillRect/>
+                    </a:stretch>
+                  </pic:blipFill>
+                  <pic:spPr>
+                    <a:xfrm>
+                      <a:off x="0" y="0"/>
+                      <a:ext cx="4038552" cy="2380889"/>
+                    </a:xfrm>
+                    <a:prstGeom prst="rect">
+                      <a:avLst/>
+                    </a:prstGeom>
+                  </pic:spPr>
+                </pic:pic>
+              </a:graphicData>
+            </a:graphic>
+          </wp:inline>
+        </w:drawing>
+      </w:r>
+    </w:p>
+    <w:p>
+      <w:pPr>
+        <w:rPr>
+          <w:b/>
+          <w:bCs/>
+          <w:lang w:val="en-US"/>
+        </w:rPr>
+      </w:pPr>
+      <w:r>
+        <w:rPr>
+          <w:b/>
+          <w:bCs/>
+          <w:lang w:val="en-US"/>
+        </w:rPr>
+        <w:drawing>
+          <wp:inline distT="0" distB="0" distL="0" distR="0" wp14:anchorId="02338CD3" wp14:editId="4D5FE050">
+            <wp:extent cx="3635055" cy="2690093"/>
+            <wp:effectExtent l="0" t="0" r="3810" b="0"/>
+            <wp:docPr id="1544634332" name="Picture 1" descr="A screen shot of a computer program&#10;&#10;AI-generated content may be incorrect."/>
+            <wp:cNvGraphicFramePr>
+              <a:graphicFrameLocks xmlns:a="http://schemas.openxmlformats.org/drawingml/2006/main" noChangeAspect="1"/>
+            </wp:cNvGraphicFramePr>
+            <a:graphic xmlns:a="http://schemas.openxmlformats.org/drawingml/2006/main">
+              <a:graphicData uri="http://schemas.openxmlformats.org/drawingml/2006/picture">
+                <pic:pic xmlns:pic="http://schemas.openxmlformats.org/drawingml/2006/picture">
+                  <pic:nvPicPr>
+                    <pic:cNvPr id="1544634332" name="Picture 1" descr="A screen shot of a computer program&#10;&#10;AI-generated content may be incorrect."/>
+                    <pic:cNvPicPr/>
+                  </pic:nvPicPr>
+                  <pic:blipFill>
+                    <a:blip r:embed="rId30"/>
+                    <a:stretch>
+                      <a:fillRect/>
+                    </a:stretch>
+                  </pic:blipFill>
+                  <pic:spPr>
+                    <a:xfrm>
+                      <a:off x="0" y="0"/>
+                      <a:ext cx="3635055" cy="2690093"/>
+                    </a:xfrm>
+                    <a:prstGeom prst="rect">
+                      <a:avLst/>
+                    </a:prstGeom>
+                  </pic:spPr>
+                </pic:pic>
+              </a:graphicData>
+            </a:graphic>
+          </wp:inline>
+        </w:drawing>
+      </w:r>
+      <w:r>
+        <w:rPr>
+          <w:b/>
+          <w:bCs/>
+          <w:lang w:val="en-US"/>
+        </w:rPr>
+        <w:t xml:space="preserve">   </w:t>
+      </w:r>
+      <w:r>
+        <w:rPr>
+          <w:b/>
+          <w:bCs/>
+          <w:lang w:val="en-US"/>
+        </w:rPr>
+        <w:drawing>
+          <wp:inline distT="0" distB="0" distL="0" distR="0" wp14:anchorId="16B4F768" wp14:editId="37841BDC">
+            <wp:extent cx="396274" cy="350550"/>
+            <wp:effectExtent l="0" t="0" r="3810" b="0"/>
+            <wp:docPr id="301565759" name="Picture 1"/>
+            <wp:cNvGraphicFramePr>
+              <a:graphicFrameLocks xmlns:a="http://schemas.openxmlformats.org/drawingml/2006/main" noChangeAspect="1"/>
+            </wp:cNvGraphicFramePr>
+            <a:graphic xmlns:a="http://schemas.openxmlformats.org/drawingml/2006/main">
+              <a:graphicData uri="http://schemas.openxmlformats.org/drawingml/2006/picture">
+                <pic:pic xmlns:pic="http://schemas.openxmlformats.org/drawingml/2006/picture">
+                  <pic:nvPicPr>
+                    <pic:cNvPr id="301565759" name=""/>
+                    <pic:cNvPicPr/>
+                  </pic:nvPicPr>
+                  <pic:blipFill>
+                    <a:blip r:embed="rId31"/>
+                    <a:stretch>
+                      <a:fillRect/>
+                    </a:stretch>
+                  </pic:blipFill>
+                  <pic:spPr>
+                    <a:xfrm>
+                      <a:off x="0" y="0"/>
+                      <a:ext cx="396274" cy="350550"/>
+                    </a:xfrm>
+                    <a:prstGeom prst="rect">
+                      <a:avLst/>
+                    </a:prstGeom>
+                  </pic:spPr>
+                </pic:pic>
+              </a:graphicData>
+            </a:graphic>
+          </wp:inline>
+        </w:drawing>
+      </w:r>
+    </w:p>
+    <w:p>
+      <w:pPr>
+        <w:rPr>
+          <w:b/>
+          <w:bCs/>
+          <w:lang w:val="en-US"/>
+        </w:rPr>
+      </w:pPr>
     </w:p>
     <w:p>
       <w:pPr>

</xml_diff>

<commit_message>
Add primeInRange method to JavaBasics for printing prime numbers up to a given limit and update main method accordingly. Enhance DSA Notes with new content on checking prime numbers in a range.
</commit_message>
<xml_diff>
--- a/Notes/DSA Notes.docx
+++ b/Notes/DSA Notes.docx
@@ -4513,9 +4513,9 @@
           <w:lang w:val="en-US"/>
         </w:rPr>
         <w:drawing>
-          <wp:inline distT="0" distB="0" distL="0" distR="0" wp14:anchorId="30A05179" wp14:editId="7CCDFD73">
-            <wp:extent cx="2955363" cy="2499360"/>
-            <wp:effectExtent l="0" t="0" r="0" b="0"/>
+          <wp:inline distT="0" distB="0" distL="0" distR="0" wp14:anchorId="30A05179" wp14:editId="6ADFFB87">
+            <wp:extent cx="2225040" cy="1881723"/>
+            <wp:effectExtent l="0" t="0" r="3810" b="4445"/>
             <wp:docPr id="120002563" name="Picture 1"/>
             <wp:cNvGraphicFramePr>
               <a:graphicFrameLocks xmlns:a="http://schemas.openxmlformats.org/drawingml/2006/main" noChangeAspect="1"/>
@@ -4536,7 +4536,7 @@
                   <pic:spPr>
                     <a:xfrm>
                       <a:off x="0" y="0"/>
-                      <a:ext cx="2965578" cy="2507999"/>
+                      <a:ext cx="2238339" cy="1892970"/>
                     </a:xfrm>
                     <a:prstGeom prst="rect">
                       <a:avLst/>
@@ -4637,9 +4637,9 @@
           <w:lang w:val="en-US"/>
         </w:rPr>
         <w:drawing>
-          <wp:inline distT="0" distB="0" distL="0" distR="0" wp14:anchorId="5348E9DD" wp14:editId="3289045E">
-            <wp:extent cx="2988989" cy="2308860"/>
-            <wp:effectExtent l="0" t="0" r="1905" b="0"/>
+          <wp:inline distT="0" distB="0" distL="0" distR="0" wp14:anchorId="5348E9DD" wp14:editId="3F459DEE">
+            <wp:extent cx="2288599" cy="1767840"/>
+            <wp:effectExtent l="0" t="0" r="0" b="3810"/>
             <wp:docPr id="1146328195" name="Picture 1" descr="A computer screen shot of a program code&#10;&#10;AI-generated content may be incorrect."/>
             <wp:cNvGraphicFramePr>
               <a:graphicFrameLocks xmlns:a="http://schemas.openxmlformats.org/drawingml/2006/main" noChangeAspect="1"/>
@@ -4660,7 +4660,7 @@
                   <pic:spPr>
                     <a:xfrm>
                       <a:off x="0" y="0"/>
-                      <a:ext cx="2993432" cy="2312292"/>
+                      <a:ext cx="2304500" cy="1780123"/>
                     </a:xfrm>
                     <a:prstGeom prst="rect">
                       <a:avLst/>
@@ -4711,6 +4711,242 @@
                     <a:xfrm>
                       <a:off x="0" y="0"/>
                       <a:ext cx="464860" cy="167655"/>
+                    </a:xfrm>
+                    <a:prstGeom prst="rect">
+                      <a:avLst/>
+                    </a:prstGeom>
+                  </pic:spPr>
+                </pic:pic>
+              </a:graphicData>
+            </a:graphic>
+          </wp:inline>
+        </w:drawing>
+      </w:r>
+    </w:p>
+    <w:p>
+      <w:pPr>
+        <w:rPr>
+          <w:b/>
+          <w:bCs/>
+          <w:lang w:val="en-US"/>
+        </w:rPr>
+      </w:pPr>
+      <w:r>
+        <w:rPr>
+          <w:b/>
+          <w:bCs/>
+          <w:lang w:val="en-US"/>
+        </w:rPr>
+        <w:t>More Optimized to check prime or not</w:t>
+      </w:r>
+    </w:p>
+    <w:p>
+      <w:pPr>
+        <w:rPr>
+          <w:b/>
+          <w:bCs/>
+          <w:lang w:val="en-US"/>
+        </w:rPr>
+      </w:pPr>
+      <w:r>
+        <w:rPr>
+          <w:b/>
+          <w:bCs/>
+          <w:lang w:val="en-US"/>
+        </w:rPr>
+        <w:drawing>
+          <wp:inline distT="0" distB="0" distL="0" distR="0" wp14:anchorId="189A454B" wp14:editId="744A2E34">
+            <wp:extent cx="2255520" cy="2132579"/>
+            <wp:effectExtent l="0" t="0" r="0" b="1270"/>
+            <wp:docPr id="1041602821" name="Picture 1"/>
+            <wp:cNvGraphicFramePr>
+              <a:graphicFrameLocks xmlns:a="http://schemas.openxmlformats.org/drawingml/2006/main" noChangeAspect="1"/>
+            </wp:cNvGraphicFramePr>
+            <a:graphic xmlns:a="http://schemas.openxmlformats.org/drawingml/2006/main">
+              <a:graphicData uri="http://schemas.openxmlformats.org/drawingml/2006/picture">
+                <pic:pic xmlns:pic="http://schemas.openxmlformats.org/drawingml/2006/picture">
+                  <pic:nvPicPr>
+                    <pic:cNvPr id="1041602821" name=""/>
+                    <pic:cNvPicPr/>
+                  </pic:nvPicPr>
+                  <pic:blipFill>
+                    <a:blip r:embed="rId36"/>
+                    <a:stretch>
+                      <a:fillRect/>
+                    </a:stretch>
+                  </pic:blipFill>
+                  <pic:spPr>
+                    <a:xfrm>
+                      <a:off x="0" y="0"/>
+                      <a:ext cx="2278111" cy="2153938"/>
+                    </a:xfrm>
+                    <a:prstGeom prst="rect">
+                      <a:avLst/>
+                    </a:prstGeom>
+                  </pic:spPr>
+                </pic:pic>
+              </a:graphicData>
+            </a:graphic>
+          </wp:inline>
+        </w:drawing>
+      </w:r>
+      <w:r>
+        <w:rPr>
+          <w:b/>
+          <w:bCs/>
+          <w:lang w:val="en-US"/>
+        </w:rPr>
+        <w:t xml:space="preserve"> </w:t>
+      </w:r>
+      <w:r>
+        <w:rPr>
+          <w:b/>
+          <w:bCs/>
+          <w:lang w:val="en-US"/>
+        </w:rPr>
+        <w:drawing>
+          <wp:inline distT="0" distB="0" distL="0" distR="0" wp14:anchorId="4A66A471" wp14:editId="5EBF7038">
+            <wp:extent cx="464860" cy="167655"/>
+            <wp:effectExtent l="0" t="0" r="0" b="3810"/>
+            <wp:docPr id="416274208" name="Picture 1"/>
+            <wp:cNvGraphicFramePr>
+              <a:graphicFrameLocks xmlns:a="http://schemas.openxmlformats.org/drawingml/2006/main" noChangeAspect="1"/>
+            </wp:cNvGraphicFramePr>
+            <a:graphic xmlns:a="http://schemas.openxmlformats.org/drawingml/2006/main">
+              <a:graphicData uri="http://schemas.openxmlformats.org/drawingml/2006/picture">
+                <pic:pic xmlns:pic="http://schemas.openxmlformats.org/drawingml/2006/picture">
+                  <pic:nvPicPr>
+                    <pic:cNvPr id="293942701" name=""/>
+                    <pic:cNvPicPr/>
+                  </pic:nvPicPr>
+                  <pic:blipFill>
+                    <a:blip r:embed="rId35"/>
+                    <a:stretch>
+                      <a:fillRect/>
+                    </a:stretch>
+                  </pic:blipFill>
+                  <pic:spPr>
+                    <a:xfrm>
+                      <a:off x="0" y="0"/>
+                      <a:ext cx="464860" cy="167655"/>
+                    </a:xfrm>
+                    <a:prstGeom prst="rect">
+                      <a:avLst/>
+                    </a:prstGeom>
+                  </pic:spPr>
+                </pic:pic>
+              </a:graphicData>
+            </a:graphic>
+          </wp:inline>
+        </w:drawing>
+      </w:r>
+    </w:p>
+    <w:p>
+      <w:pPr>
+        <w:rPr>
+          <w:b/>
+          <w:bCs/>
+          <w:lang w:val="en-US"/>
+        </w:rPr>
+      </w:pPr>
+      <w:r>
+        <w:rPr>
+          <w:b/>
+          <w:bCs/>
+          <w:lang w:val="en-US"/>
+        </w:rPr>
+        <w:t>Check prime numbers in a range</w:t>
+      </w:r>
+    </w:p>
+    <w:p>
+      <w:pPr>
+        <w:rPr>
+          <w:b/>
+          <w:bCs/>
+          <w:lang w:val="en-US"/>
+        </w:rPr>
+      </w:pPr>
+      <w:r>
+        <w:rPr>
+          <w:b/>
+          <w:bCs/>
+          <w:lang w:val="en-US"/>
+        </w:rPr>
+        <w:drawing>
+          <wp:inline distT="0" distB="0" distL="0" distR="0" wp14:anchorId="7AEF354C" wp14:editId="230C80DB">
+            <wp:extent cx="2148840" cy="1551939"/>
+            <wp:effectExtent l="0" t="0" r="3810" b="0"/>
+            <wp:docPr id="1250872742" name="Picture 1"/>
+            <wp:cNvGraphicFramePr>
+              <a:graphicFrameLocks xmlns:a="http://schemas.openxmlformats.org/drawingml/2006/main" noChangeAspect="1"/>
+            </wp:cNvGraphicFramePr>
+            <a:graphic xmlns:a="http://schemas.openxmlformats.org/drawingml/2006/main">
+              <a:graphicData uri="http://schemas.openxmlformats.org/drawingml/2006/picture">
+                <pic:pic xmlns:pic="http://schemas.openxmlformats.org/drawingml/2006/picture">
+                  <pic:nvPicPr>
+                    <pic:cNvPr id="1250872742" name=""/>
+                    <pic:cNvPicPr/>
+                  </pic:nvPicPr>
+                  <pic:blipFill>
+                    <a:blip r:embed="rId37"/>
+                    <a:stretch>
+                      <a:fillRect/>
+                    </a:stretch>
+                  </pic:blipFill>
+                  <pic:spPr>
+                    <a:xfrm>
+                      <a:off x="0" y="0"/>
+                      <a:ext cx="2169346" cy="1566749"/>
+                    </a:xfrm>
+                    <a:prstGeom prst="rect">
+                      <a:avLst/>
+                    </a:prstGeom>
+                  </pic:spPr>
+                </pic:pic>
+              </a:graphicData>
+            </a:graphic>
+          </wp:inline>
+        </w:drawing>
+      </w:r>
+      <w:r>
+        <w:rPr>
+          <w:b/>
+          <w:bCs/>
+          <w:lang w:val="en-US"/>
+        </w:rPr>
+        <w:t xml:space="preserve">    </w:t>
+      </w:r>
+      <w:r>
+        <w:rPr>
+          <w:b/>
+          <w:bCs/>
+          <w:lang w:val="en-US"/>
+        </w:rPr>
+        <w:drawing>
+          <wp:inline distT="0" distB="0" distL="0" distR="0" wp14:anchorId="711E9729" wp14:editId="3D9A05A4">
+            <wp:extent cx="1691787" cy="160034"/>
+            <wp:effectExtent l="0" t="0" r="3810" b="0"/>
+            <wp:docPr id="643508615" name="Picture 1"/>
+            <wp:cNvGraphicFramePr>
+              <a:graphicFrameLocks xmlns:a="http://schemas.openxmlformats.org/drawingml/2006/main" noChangeAspect="1"/>
+            </wp:cNvGraphicFramePr>
+            <a:graphic xmlns:a="http://schemas.openxmlformats.org/drawingml/2006/main">
+              <a:graphicData uri="http://schemas.openxmlformats.org/drawingml/2006/picture">
+                <pic:pic xmlns:pic="http://schemas.openxmlformats.org/drawingml/2006/picture">
+                  <pic:nvPicPr>
+                    <pic:cNvPr id="643508615" name=""/>
+                    <pic:cNvPicPr/>
+                  </pic:nvPicPr>
+                  <pic:blipFill>
+                    <a:blip r:embed="rId38"/>
+                    <a:stretch>
+                      <a:fillRect/>
+                    </a:stretch>
+                  </pic:blipFill>
+                  <pic:spPr>
+                    <a:xfrm>
+                      <a:off x="0" y="0"/>
+                      <a:ext cx="1691787" cy="160034"/>
                     </a:xfrm>
                     <a:prstGeom prst="rect">
                       <a:avLst/>

</xml_diff>

<commit_message>
Code - Binary to Decimal
</commit_message>
<xml_diff>
--- a/Notes/DSA Notes.docx
+++ b/Notes/DSA Notes.docx
@@ -281,17 +281,41 @@
     </w:p>
     <w:p>
       <w:r>
-        <w:t xml:space="preserve">  Add(tea leaves)  </w:t>
-      </w:r>
-    </w:p>
-    <w:p>
-      <w:r>
-        <w:t xml:space="preserve">  Add(sugar, milk)  </w:t>
-      </w:r>
-    </w:p>
-    <w:p>
-      <w:r>
-        <w:t xml:space="preserve">  Boil(2 minutes)  </w:t>
+        <w:t xml:space="preserve">  </w:t>
+      </w:r>
+      <w:proofErr w:type="gramStart"/>
+      <w:r>
+        <w:t>Add(</w:t>
+      </w:r>
+      <w:proofErr w:type="gramEnd"/>
+      <w:r>
+        <w:t xml:space="preserve">tea leaves)  </w:t>
+      </w:r>
+    </w:p>
+    <w:p>
+      <w:r>
+        <w:t xml:space="preserve">  </w:t>
+      </w:r>
+      <w:proofErr w:type="gramStart"/>
+      <w:r>
+        <w:t>Add(</w:t>
+      </w:r>
+      <w:proofErr w:type="gramEnd"/>
+      <w:r>
+        <w:t xml:space="preserve">sugar, milk)  </w:t>
+      </w:r>
+    </w:p>
+    <w:p>
+      <w:r>
+        <w:t xml:space="preserve">  </w:t>
+      </w:r>
+      <w:proofErr w:type="gramStart"/>
+      <w:r>
+        <w:t>Boil(</w:t>
+      </w:r>
+      <w:proofErr w:type="gramEnd"/>
+      <w:r>
+        <w:t xml:space="preserve">2 minutes)  </w:t>
       </w:r>
     </w:p>
     <w:p>
@@ -1134,8 +1158,13 @@
             <w:hideMark/>
           </w:tcPr>
           <w:p>
-            <w:r>
-              <w:t>a != b</w:t>
+            <w:proofErr w:type="gramStart"/>
+            <w:r>
+              <w:t>a !</w:t>
+            </w:r>
+            <w:proofErr w:type="gramEnd"/>
+            <w:r>
+              <w:t>= b</w:t>
             </w:r>
           </w:p>
         </w:tc>
@@ -1562,8 +1591,13 @@
             <w:r>
               <w:t xml:space="preserve">     </w:t>
             </w:r>
-            <w:r>
-              <w:t>!(a &gt; b)</w:t>
+            <w:proofErr w:type="gramStart"/>
+            <w:r>
+              <w:t>!(</w:t>
+            </w:r>
+            <w:proofErr w:type="gramEnd"/>
+            <w:r>
+              <w:t>a &gt; b)</w:t>
             </w:r>
           </w:p>
         </w:tc>
@@ -2253,9 +2287,11 @@
             <w:hideMark/>
           </w:tcPr>
           <w:p>
+            <w:proofErr w:type="gramStart"/>
             <w:r>
               <w:t>!true</w:t>
             </w:r>
+            <w:proofErr w:type="gramEnd"/>
           </w:p>
         </w:tc>
       </w:tr>
@@ -2821,7 +2857,23 @@
           </w:tcPr>
           <w:p>
             <w:r>
-              <w:t>a &gt; b ? a : b</w:t>
+              <w:t xml:space="preserve">a &gt; </w:t>
+            </w:r>
+            <w:proofErr w:type="gramStart"/>
+            <w:r>
+              <w:t>b ?</w:t>
+            </w:r>
+            <w:proofErr w:type="gramEnd"/>
+            <w:r>
+              <w:t xml:space="preserve"> </w:t>
+            </w:r>
+            <w:proofErr w:type="gramStart"/>
+            <w:r>
+              <w:t>a :</w:t>
+            </w:r>
+            <w:proofErr w:type="gramEnd"/>
+            <w:r>
+              <w:t xml:space="preserve"> b</w:t>
             </w:r>
           </w:p>
         </w:tc>
@@ -2848,7 +2900,23 @@
           <w:b/>
           <w:bCs/>
         </w:rPr>
-        <w:t xml:space="preserve"> 8. instanceof Operator</w:t>
+        <w:t xml:space="preserve"> 8. </w:t>
+      </w:r>
+      <w:proofErr w:type="spellStart"/>
+      <w:r>
+        <w:rPr>
+          <w:b/>
+          <w:bCs/>
+        </w:rPr>
+        <w:t>instanceof</w:t>
+      </w:r>
+      <w:proofErr w:type="spellEnd"/>
+      <w:r>
+        <w:rPr>
+          <w:b/>
+          <w:bCs/>
+        </w:rPr>
+        <w:t xml:space="preserve"> Operator</w:t>
       </w:r>
     </w:p>
     <w:p>
@@ -2956,9 +3024,11 @@
             <w:hideMark/>
           </w:tcPr>
           <w:p>
+            <w:proofErr w:type="spellStart"/>
             <w:r>
               <w:t>instanceof</w:t>
             </w:r>
+            <w:proofErr w:type="spellEnd"/>
           </w:p>
         </w:tc>
         <w:tc>
@@ -2980,8 +3050,21 @@
             <w:hideMark/>
           </w:tcPr>
           <w:p>
-            <w:r>
-              <w:t>obj instanceof String</w:t>
+            <w:proofErr w:type="spellStart"/>
+            <w:r>
+              <w:t>obj</w:t>
+            </w:r>
+            <w:proofErr w:type="spellEnd"/>
+            <w:r>
+              <w:t xml:space="preserve"> </w:t>
+            </w:r>
+            <w:proofErr w:type="spellStart"/>
+            <w:r>
+              <w:t>instanceof</w:t>
+            </w:r>
+            <w:proofErr w:type="spellEnd"/>
+            <w:r>
+              <w:t xml:space="preserve"> String</w:t>
             </w:r>
           </w:p>
         </w:tc>
@@ -4076,17 +4159,49 @@
           <w:b/>
           <w:bCs/>
         </w:rPr>
-        <w:t>Q. Function Overloading</w:t>
-      </w:r>
-      <w:r>
-        <w:rPr>
-          <w:b/>
-          <w:bCs/>
-        </w:rPr>
-        <w:t xml:space="preserve"> : </w:t>
-      </w:r>
-      <w:r>
-        <w:t>It depend on parameter , not return type</w:t>
+        <w:t xml:space="preserve">Q. Function </w:t>
+      </w:r>
+      <w:proofErr w:type="gramStart"/>
+      <w:r>
+        <w:rPr>
+          <w:b/>
+          <w:bCs/>
+        </w:rPr>
+        <w:t>Overloading</w:t>
+      </w:r>
+      <w:r>
+        <w:rPr>
+          <w:b/>
+          <w:bCs/>
+        </w:rPr>
+        <w:t xml:space="preserve"> :</w:t>
+      </w:r>
+      <w:proofErr w:type="gramEnd"/>
+      <w:r>
+        <w:rPr>
+          <w:b/>
+          <w:bCs/>
+        </w:rPr>
+        <w:t xml:space="preserve"> </w:t>
+      </w:r>
+      <w:r>
+        <w:t xml:space="preserve">It </w:t>
+      </w:r>
+      <w:proofErr w:type="gramStart"/>
+      <w:r>
+        <w:t>depend</w:t>
+      </w:r>
+      <w:proofErr w:type="gramEnd"/>
+      <w:r>
+        <w:t xml:space="preserve"> on </w:t>
+      </w:r>
+      <w:proofErr w:type="gramStart"/>
+      <w:r>
+        <w:t>parameter ,</w:t>
+      </w:r>
+      <w:proofErr w:type="gramEnd"/>
+      <w:r>
+        <w:t xml:space="preserve"> not return type</w:t>
       </w:r>
     </w:p>
     <w:p>
@@ -4150,7 +4265,23 @@
           <w:b/>
           <w:bCs/>
         </w:rPr>
-        <w:t>Using parameter’s:</w:t>
+        <w:t xml:space="preserve">Using </w:t>
+      </w:r>
+      <w:proofErr w:type="gramStart"/>
+      <w:r>
+        <w:rPr>
+          <w:b/>
+          <w:bCs/>
+        </w:rPr>
+        <w:t>parameter’s</w:t>
+      </w:r>
+      <w:proofErr w:type="gramEnd"/>
+      <w:r>
+        <w:rPr>
+          <w:b/>
+          <w:bCs/>
+        </w:rPr>
+        <w:t>:</w:t>
       </w:r>
     </w:p>
     <w:p>
@@ -4318,7 +4449,25 @@
           <w:bCs/>
           <w:lang w:val="en-US"/>
         </w:rPr>
-        <w:t>Using datatypes:</w:t>
+        <w:t xml:space="preserve">Using </w:t>
+      </w:r>
+      <w:proofErr w:type="gramStart"/>
+      <w:r>
+        <w:rPr>
+          <w:b/>
+          <w:bCs/>
+          <w:lang w:val="en-US"/>
+        </w:rPr>
+        <w:t>datatypes</w:t>
+      </w:r>
+      <w:proofErr w:type="gramEnd"/>
+      <w:r>
+        <w:rPr>
+          <w:b/>
+          <w:bCs/>
+          <w:lang w:val="en-US"/>
+        </w:rPr>
+        <w:t>:</w:t>
       </w:r>
     </w:p>
     <w:p>
@@ -4951,6 +5100,137 @@
                     <a:prstGeom prst="rect">
                       <a:avLst/>
                     </a:prstGeom>
+                  </pic:spPr>
+                </pic:pic>
+              </a:graphicData>
+            </a:graphic>
+          </wp:inline>
+        </w:drawing>
+      </w:r>
+    </w:p>
+    <w:p>
+      <w:pPr>
+        <w:rPr>
+          <w:b/>
+          <w:bCs/>
+          <w:lang w:val="en-US"/>
+        </w:rPr>
+      </w:pPr>
+      <w:r>
+        <w:rPr>
+          <w:b/>
+          <w:bCs/>
+          <w:lang w:val="en-US"/>
+        </w:rPr>
+        <w:lastRenderedPageBreak/>
+        <w:t>Convert binary to decimal</w:t>
+      </w:r>
+    </w:p>
+    <w:p>
+      <w:pPr>
+        <w:rPr>
+          <w:b/>
+          <w:bCs/>
+          <w:lang w:val="en-US"/>
+        </w:rPr>
+      </w:pPr>
+      <w:r>
+        <w:rPr>
+          <w:b/>
+          <w:bCs/>
+          <w:lang w:val="en-US"/>
+        </w:rPr>
+        <w:drawing>
+          <wp:inline distT="0" distB="0" distL="0" distR="0" wp14:anchorId="1B8A7A4A" wp14:editId="589A41E7">
+            <wp:extent cx="3886081" cy="2468880"/>
+            <wp:effectExtent l="0" t="0" r="635" b="7620"/>
+            <wp:docPr id="693323528" name="Picture 1"/>
+            <wp:cNvGraphicFramePr>
+              <a:graphicFrameLocks xmlns:a="http://schemas.openxmlformats.org/drawingml/2006/main" noChangeAspect="1"/>
+            </wp:cNvGraphicFramePr>
+            <a:graphic xmlns:a="http://schemas.openxmlformats.org/drawingml/2006/main">
+              <a:graphicData uri="http://schemas.openxmlformats.org/drawingml/2006/picture">
+                <pic:pic xmlns:pic="http://schemas.openxmlformats.org/drawingml/2006/picture">
+                  <pic:nvPicPr>
+                    <pic:cNvPr id="693323528" name=""/>
+                    <pic:cNvPicPr/>
+                  </pic:nvPicPr>
+                  <pic:blipFill>
+                    <a:blip r:embed="rId39"/>
+                    <a:stretch>
+                      <a:fillRect/>
+                    </a:stretch>
+                  </pic:blipFill>
+                  <pic:spPr>
+                    <a:xfrm>
+                      <a:off x="0" y="0"/>
+                      <a:ext cx="3890718" cy="2471826"/>
+                    </a:xfrm>
+                    <a:prstGeom prst="rect">
+                      <a:avLst/>
+                    </a:prstGeom>
+                  </pic:spPr>
+                </pic:pic>
+              </a:graphicData>
+            </a:graphic>
+          </wp:inline>
+        </w:drawing>
+      </w:r>
+    </w:p>
+    <w:p>
+      <w:pPr>
+        <w:rPr>
+          <w:b/>
+          <w:bCs/>
+          <w:lang w:val="en-US"/>
+        </w:rPr>
+      </w:pPr>
+      <w:r>
+        <w:rPr>
+          <w:noProof/>
+        </w:rPr>
+        <w:drawing>
+          <wp:inline distT="0" distB="0" distL="0" distR="0" wp14:anchorId="3D1824AF" wp14:editId="2F968A9C">
+            <wp:extent cx="4449427" cy="3246120"/>
+            <wp:effectExtent l="0" t="0" r="8890" b="0"/>
+            <wp:docPr id="393064932" name="Picture 1" descr="A screenshot of a computer&#10;&#10;AI-generated content may be incorrect."/>
+            <wp:cNvGraphicFramePr>
+              <a:graphicFrameLocks xmlns:a="http://schemas.openxmlformats.org/drawingml/2006/main" noChangeAspect="1"/>
+            </wp:cNvGraphicFramePr>
+            <a:graphic xmlns:a="http://schemas.openxmlformats.org/drawingml/2006/main">
+              <a:graphicData uri="http://schemas.openxmlformats.org/drawingml/2006/picture">
+                <pic:pic xmlns:pic="http://schemas.openxmlformats.org/drawingml/2006/picture">
+                  <pic:nvPicPr>
+                    <pic:cNvPr id="393064932" name="Picture 1" descr="A screenshot of a computer&#10;&#10;AI-generated content may be incorrect."/>
+                    <pic:cNvPicPr>
+                      <a:picLocks noChangeAspect="1" noChangeArrowheads="1"/>
+                    </pic:cNvPicPr>
+                  </pic:nvPicPr>
+                  <pic:blipFill>
+                    <a:blip r:embed="rId40" cstate="print">
+                      <a:extLst>
+                        <a:ext uri="{28A0092B-C50C-407E-A947-70E740481C1C}">
+                          <a14:useLocalDpi xmlns:a14="http://schemas.microsoft.com/office/drawing/2010/main" val="0"/>
+                        </a:ext>
+                      </a:extLst>
+                    </a:blip>
+                    <a:srcRect/>
+                    <a:stretch>
+                      <a:fillRect/>
+                    </a:stretch>
+                  </pic:blipFill>
+                  <pic:spPr bwMode="auto">
+                    <a:xfrm>
+                      <a:off x="0" y="0"/>
+                      <a:ext cx="4455071" cy="3250237"/>
+                    </a:xfrm>
+                    <a:prstGeom prst="rect">
+                      <a:avLst/>
+                    </a:prstGeom>
+                    <a:noFill/>
+                    <a:ln>
+                      <a:noFill/>
+                    </a:ln>
                   </pic:spPr>
                 </pic:pic>
               </a:graphicData>

</xml_diff>

<commit_message>
Remove sumOfDigits method and related user input from JavaBasics; add .gitignore to exclude build artifacts
</commit_message>
<xml_diff>
--- a/Notes/DSA Notes.docx
+++ b/Notes/DSA Notes.docx
@@ -5231,6 +5231,74 @@
                     <a:ln>
                       <a:noFill/>
                     </a:ln>
+                  </pic:spPr>
+                </pic:pic>
+              </a:graphicData>
+            </a:graphic>
+          </wp:inline>
+        </w:drawing>
+      </w:r>
+    </w:p>
+    <w:p>
+      <w:pPr>
+        <w:rPr>
+          <w:b/>
+          <w:bCs/>
+          <w:lang w:val="en-US"/>
+        </w:rPr>
+      </w:pPr>
+      <w:r>
+        <w:rPr>
+          <w:b/>
+          <w:bCs/>
+          <w:lang w:val="en-US"/>
+        </w:rPr>
+        <w:t>Decimal to Binary:</w:t>
+      </w:r>
+    </w:p>
+    <w:p>
+      <w:pPr>
+        <w:rPr>
+          <w:b/>
+          <w:bCs/>
+          <w:lang w:val="en-US"/>
+        </w:rPr>
+      </w:pPr>
+      <w:r>
+        <w:rPr>
+          <w:b/>
+          <w:bCs/>
+          <w:lang w:val="en-US"/>
+        </w:rPr>
+        <w:drawing>
+          <wp:inline distT="0" distB="0" distL="0" distR="0" wp14:anchorId="49B9F7AD" wp14:editId="0A5ABF84">
+            <wp:extent cx="3840480" cy="2317959"/>
+            <wp:effectExtent l="0" t="0" r="7620" b="6350"/>
+            <wp:docPr id="2092241924" name="Picture 1" descr="A graph on a blackboard&#10;&#10;AI-generated content may be incorrect."/>
+            <wp:cNvGraphicFramePr>
+              <a:graphicFrameLocks xmlns:a="http://schemas.openxmlformats.org/drawingml/2006/main" noChangeAspect="1"/>
+            </wp:cNvGraphicFramePr>
+            <a:graphic xmlns:a="http://schemas.openxmlformats.org/drawingml/2006/main">
+              <a:graphicData uri="http://schemas.openxmlformats.org/drawingml/2006/picture">
+                <pic:pic xmlns:pic="http://schemas.openxmlformats.org/drawingml/2006/picture">
+                  <pic:nvPicPr>
+                    <pic:cNvPr id="2092241924" name="Picture 1" descr="A graph on a blackboard&#10;&#10;AI-generated content may be incorrect."/>
+                    <pic:cNvPicPr/>
+                  </pic:nvPicPr>
+                  <pic:blipFill>
+                    <a:blip r:embed="rId41"/>
+                    <a:stretch>
+                      <a:fillRect/>
+                    </a:stretch>
+                  </pic:blipFill>
+                  <pic:spPr>
+                    <a:xfrm>
+                      <a:off x="0" y="0"/>
+                      <a:ext cx="3866395" cy="2333600"/>
+                    </a:xfrm>
+                    <a:prstGeom prst="rect">
+                      <a:avLst/>
+                    </a:prstGeom>
                   </pic:spPr>
                 </pic:pic>
               </a:graphicData>

</xml_diff>

<commit_message>
Add pattern section for Decimal to Binary conversion in DSA Notes
</commit_message>
<xml_diff>
--- a/Notes/DSA Notes.docx
+++ b/Notes/DSA Notes.docx
@@ -281,41 +281,17 @@
     </w:p>
     <w:p>
       <w:r>
-        <w:t xml:space="preserve">  </w:t>
-      </w:r>
-      <w:proofErr w:type="gramStart"/>
-      <w:r>
-        <w:t>Add(</w:t>
-      </w:r>
-      <w:proofErr w:type="gramEnd"/>
-      <w:r>
-        <w:t xml:space="preserve">tea leaves)  </w:t>
-      </w:r>
-    </w:p>
-    <w:p>
-      <w:r>
-        <w:t xml:space="preserve">  </w:t>
-      </w:r>
-      <w:proofErr w:type="gramStart"/>
-      <w:r>
-        <w:t>Add(</w:t>
-      </w:r>
-      <w:proofErr w:type="gramEnd"/>
-      <w:r>
-        <w:t xml:space="preserve">sugar, milk)  </w:t>
-      </w:r>
-    </w:p>
-    <w:p>
-      <w:r>
-        <w:t xml:space="preserve">  </w:t>
-      </w:r>
-      <w:proofErr w:type="gramStart"/>
-      <w:r>
-        <w:t>Boil(</w:t>
-      </w:r>
-      <w:proofErr w:type="gramEnd"/>
-      <w:r>
-        <w:t xml:space="preserve">2 minutes)  </w:t>
+        <w:t xml:space="preserve">  Add(tea leaves)  </w:t>
+      </w:r>
+    </w:p>
+    <w:p>
+      <w:r>
+        <w:t xml:space="preserve">  Add(sugar, milk)  </w:t>
+      </w:r>
+    </w:p>
+    <w:p>
+      <w:r>
+        <w:t xml:space="preserve">  Boil(2 minutes)  </w:t>
       </w:r>
     </w:p>
     <w:p>
@@ -1158,13 +1134,8 @@
             <w:hideMark/>
           </w:tcPr>
           <w:p>
-            <w:proofErr w:type="gramStart"/>
-            <w:r>
-              <w:t>a !</w:t>
-            </w:r>
-            <w:proofErr w:type="gramEnd"/>
-            <w:r>
-              <w:t>= b</w:t>
+            <w:r>
+              <w:t>a != b</w:t>
             </w:r>
           </w:p>
         </w:tc>
@@ -1591,13 +1562,8 @@
             <w:r>
               <w:t xml:space="preserve">     </w:t>
             </w:r>
-            <w:proofErr w:type="gramStart"/>
-            <w:r>
-              <w:t>!(</w:t>
-            </w:r>
-            <w:proofErr w:type="gramEnd"/>
-            <w:r>
-              <w:t>a &gt; b)</w:t>
+            <w:r>
+              <w:t>!(a &gt; b)</w:t>
             </w:r>
           </w:p>
         </w:tc>
@@ -2287,11 +2253,9 @@
             <w:hideMark/>
           </w:tcPr>
           <w:p>
-            <w:proofErr w:type="gramStart"/>
             <w:r>
               <w:t>!true</w:t>
             </w:r>
-            <w:proofErr w:type="gramEnd"/>
           </w:p>
         </w:tc>
       </w:tr>
@@ -2857,23 +2821,7 @@
           </w:tcPr>
           <w:p>
             <w:r>
-              <w:t xml:space="preserve">a &gt; </w:t>
-            </w:r>
-            <w:proofErr w:type="gramStart"/>
-            <w:r>
-              <w:t>b ?</w:t>
-            </w:r>
-            <w:proofErr w:type="gramEnd"/>
-            <w:r>
-              <w:t xml:space="preserve"> </w:t>
-            </w:r>
-            <w:proofErr w:type="gramStart"/>
-            <w:r>
-              <w:t>a :</w:t>
-            </w:r>
-            <w:proofErr w:type="gramEnd"/>
-            <w:r>
-              <w:t xml:space="preserve"> b</w:t>
+              <w:t>a &gt; b ? a : b</w:t>
             </w:r>
           </w:p>
         </w:tc>
@@ -2900,23 +2848,7 @@
           <w:b/>
           <w:bCs/>
         </w:rPr>
-        <w:t xml:space="preserve"> 8. </w:t>
-      </w:r>
-      <w:proofErr w:type="spellStart"/>
-      <w:r>
-        <w:rPr>
-          <w:b/>
-          <w:bCs/>
-        </w:rPr>
-        <w:t>instanceof</w:t>
-      </w:r>
-      <w:proofErr w:type="spellEnd"/>
-      <w:r>
-        <w:rPr>
-          <w:b/>
-          <w:bCs/>
-        </w:rPr>
-        <w:t xml:space="preserve"> Operator</w:t>
+        <w:t xml:space="preserve"> 8. instanceof Operator</w:t>
       </w:r>
     </w:p>
     <w:p>
@@ -3024,11 +2956,9 @@
             <w:hideMark/>
           </w:tcPr>
           <w:p>
-            <w:proofErr w:type="spellStart"/>
             <w:r>
               <w:t>instanceof</w:t>
             </w:r>
-            <w:proofErr w:type="spellEnd"/>
           </w:p>
         </w:tc>
         <w:tc>
@@ -3050,21 +2980,8 @@
             <w:hideMark/>
           </w:tcPr>
           <w:p>
-            <w:proofErr w:type="spellStart"/>
-            <w:r>
-              <w:t>obj</w:t>
-            </w:r>
-            <w:proofErr w:type="spellEnd"/>
-            <w:r>
-              <w:t xml:space="preserve"> </w:t>
-            </w:r>
-            <w:proofErr w:type="spellStart"/>
-            <w:r>
-              <w:t>instanceof</w:t>
-            </w:r>
-            <w:proofErr w:type="spellEnd"/>
-            <w:r>
-              <w:t xml:space="preserve"> String</w:t>
+            <w:r>
+              <w:t>obj instanceof String</w:t>
             </w:r>
           </w:p>
         </w:tc>
@@ -3983,6 +3900,9 @@
     </w:p>
     <w:p>
       <w:r>
+        <w:rPr>
+          <w:noProof/>
+        </w:rPr>
         <w:drawing>
           <wp:inline distT="0" distB="0" distL="0" distR="0" wp14:anchorId="7985814F" wp14:editId="478C6CBB">
             <wp:extent cx="4579620" cy="2035105"/>
@@ -4022,6 +3942,9 @@
     </w:p>
     <w:p>
       <w:r>
+        <w:rPr>
+          <w:noProof/>
+        </w:rPr>
         <w:drawing>
           <wp:inline distT="0" distB="0" distL="0" distR="0" wp14:anchorId="78544AE1" wp14:editId="58922875">
             <wp:extent cx="4617720" cy="1150593"/>
@@ -4061,6 +3984,9 @@
     </w:p>
     <w:p>
       <w:r>
+        <w:rPr>
+          <w:noProof/>
+        </w:rPr>
         <w:drawing>
           <wp:inline distT="0" distB="0" distL="0" distR="0" wp14:anchorId="5FBA65FF" wp14:editId="0DB5017F">
             <wp:extent cx="3451860" cy="5139826"/>
@@ -4116,6 +4042,9 @@
     </w:p>
     <w:p>
       <w:r>
+        <w:rPr>
+          <w:noProof/>
+        </w:rPr>
         <w:drawing>
           <wp:inline distT="0" distB="0" distL="0" distR="0" wp14:anchorId="5CAFA0A7" wp14:editId="58B305E7">
             <wp:extent cx="3170195" cy="2530059"/>
@@ -4159,62 +4088,31 @@
           <w:b/>
           <w:bCs/>
         </w:rPr>
-        <w:t xml:space="preserve">Q. Function </w:t>
-      </w:r>
-      <w:proofErr w:type="gramStart"/>
-      <w:r>
-        <w:rPr>
-          <w:b/>
-          <w:bCs/>
-        </w:rPr>
-        <w:t>Overloading</w:t>
-      </w:r>
-      <w:r>
-        <w:rPr>
-          <w:b/>
-          <w:bCs/>
-        </w:rPr>
-        <w:t xml:space="preserve"> :</w:t>
-      </w:r>
-      <w:proofErr w:type="gramEnd"/>
-      <w:r>
-        <w:rPr>
-          <w:b/>
-          <w:bCs/>
-        </w:rPr>
-        <w:t xml:space="preserve"> </w:t>
-      </w:r>
-      <w:r>
-        <w:t xml:space="preserve">It </w:t>
-      </w:r>
-      <w:proofErr w:type="gramStart"/>
-      <w:r>
-        <w:t>depend</w:t>
-      </w:r>
-      <w:proofErr w:type="gramEnd"/>
-      <w:r>
-        <w:t xml:space="preserve"> on </w:t>
-      </w:r>
-      <w:proofErr w:type="gramStart"/>
-      <w:r>
-        <w:t>parameter ,</w:t>
-      </w:r>
-      <w:proofErr w:type="gramEnd"/>
-      <w:r>
-        <w:t xml:space="preserve"> not return type</w:t>
-      </w:r>
-    </w:p>
-    <w:p>
-      <w:pPr>
-        <w:rPr>
-          <w:b/>
-          <w:bCs/>
-        </w:rPr>
-      </w:pPr>
-      <w:r>
-        <w:rPr>
-          <w:b/>
-          <w:bCs/>
+        <w:t>Q. Function Overloading</w:t>
+      </w:r>
+      <w:r>
+        <w:rPr>
+          <w:b/>
+          <w:bCs/>
+        </w:rPr>
+        <w:t xml:space="preserve"> : </w:t>
+      </w:r>
+      <w:r>
+        <w:t>It depend on parameter , not return type</w:t>
+      </w:r>
+    </w:p>
+    <w:p>
+      <w:pPr>
+        <w:rPr>
+          <w:b/>
+          <w:bCs/>
+        </w:rPr>
+      </w:pPr>
+      <w:r>
+        <w:rPr>
+          <w:b/>
+          <w:bCs/>
+          <w:noProof/>
         </w:rPr>
         <w:drawing>
           <wp:inline distT="0" distB="0" distL="0" distR="0" wp14:anchorId="20C1698F" wp14:editId="5B85894A">
@@ -4265,36 +4163,21 @@
           <w:b/>
           <w:bCs/>
         </w:rPr>
-        <w:t xml:space="preserve">Using </w:t>
-      </w:r>
-      <w:proofErr w:type="gramStart"/>
-      <w:r>
-        <w:rPr>
-          <w:b/>
-          <w:bCs/>
-        </w:rPr>
-        <w:t>parameter’s</w:t>
-      </w:r>
-      <w:proofErr w:type="gramEnd"/>
-      <w:r>
-        <w:rPr>
-          <w:b/>
-          <w:bCs/>
-        </w:rPr>
-        <w:t>:</w:t>
-      </w:r>
-    </w:p>
-    <w:p>
-      <w:pPr>
-        <w:rPr>
-          <w:b/>
-          <w:bCs/>
-        </w:rPr>
-      </w:pPr>
-      <w:r>
-        <w:rPr>
-          <w:b/>
-          <w:bCs/>
+        <w:t>Using parameter’s:</w:t>
+      </w:r>
+    </w:p>
+    <w:p>
+      <w:pPr>
+        <w:rPr>
+          <w:b/>
+          <w:bCs/>
+        </w:rPr>
+      </w:pPr>
+      <w:r>
+        <w:rPr>
+          <w:b/>
+          <w:bCs/>
+          <w:noProof/>
         </w:rPr>
         <w:drawing>
           <wp:inline distT="0" distB="0" distL="0" distR="0" wp14:anchorId="05640AC9" wp14:editId="33D9D1EA">
@@ -4345,6 +4228,7 @@
         <w:rPr>
           <w:b/>
           <w:bCs/>
+          <w:noProof/>
           <w:lang w:val="en-US"/>
         </w:rPr>
         <w:lastRenderedPageBreak/>
@@ -4396,6 +4280,7 @@
         <w:rPr>
           <w:b/>
           <w:bCs/>
+          <w:noProof/>
           <w:lang w:val="en-US"/>
         </w:rPr>
         <w:drawing>
@@ -4449,39 +4334,22 @@
           <w:bCs/>
           <w:lang w:val="en-US"/>
         </w:rPr>
-        <w:t xml:space="preserve">Using </w:t>
-      </w:r>
-      <w:proofErr w:type="gramStart"/>
-      <w:r>
+        <w:t>Using datatypes:</w:t>
+      </w:r>
+    </w:p>
+    <w:p>
+      <w:pPr>
         <w:rPr>
           <w:b/>
           <w:bCs/>
           <w:lang w:val="en-US"/>
         </w:rPr>
-        <w:t>datatypes</w:t>
-      </w:r>
-      <w:proofErr w:type="gramEnd"/>
-      <w:r>
-        <w:rPr>
-          <w:b/>
-          <w:bCs/>
-          <w:lang w:val="en-US"/>
-        </w:rPr>
-        <w:t>:</w:t>
-      </w:r>
-    </w:p>
-    <w:p>
-      <w:pPr>
-        <w:rPr>
-          <w:b/>
-          <w:bCs/>
-          <w:lang w:val="en-US"/>
-        </w:rPr>
-      </w:pPr>
-      <w:r>
-        <w:rPr>
-          <w:b/>
-          <w:bCs/>
+      </w:pPr>
+      <w:r>
+        <w:rPr>
+          <w:b/>
+          <w:bCs/>
+          <w:noProof/>
           <w:lang w:val="en-US"/>
         </w:rPr>
         <w:drawing>
@@ -4533,6 +4401,7 @@
         <w:rPr>
           <w:b/>
           <w:bCs/>
+          <w:noProof/>
           <w:lang w:val="en-US"/>
         </w:rPr>
         <w:drawing>
@@ -4583,6 +4452,7 @@
         <w:rPr>
           <w:b/>
           <w:bCs/>
+          <w:noProof/>
           <w:lang w:val="en-US"/>
         </w:rPr>
         <w:drawing>
@@ -4659,6 +4529,7 @@
         <w:rPr>
           <w:b/>
           <w:bCs/>
+          <w:noProof/>
           <w:lang w:val="en-US"/>
         </w:rPr>
         <w:drawing>
@@ -4709,6 +4580,7 @@
         <w:rPr>
           <w:b/>
           <w:bCs/>
+          <w:noProof/>
           <w:lang w:val="en-US"/>
         </w:rPr>
         <w:drawing>
@@ -4783,6 +4655,7 @@
         <w:rPr>
           <w:b/>
           <w:bCs/>
+          <w:noProof/>
           <w:lang w:val="en-US"/>
         </w:rPr>
         <w:drawing>
@@ -4833,6 +4706,7 @@
         <w:rPr>
           <w:b/>
           <w:bCs/>
+          <w:noProof/>
           <w:lang w:val="en-US"/>
         </w:rPr>
         <w:drawing>
@@ -4901,6 +4775,7 @@
         <w:rPr>
           <w:b/>
           <w:bCs/>
+          <w:noProof/>
           <w:lang w:val="en-US"/>
         </w:rPr>
         <w:drawing>
@@ -4951,6 +4826,7 @@
         <w:rPr>
           <w:b/>
           <w:bCs/>
+          <w:noProof/>
           <w:lang w:val="en-US"/>
         </w:rPr>
         <w:drawing>
@@ -5019,6 +4895,7 @@
         <w:rPr>
           <w:b/>
           <w:bCs/>
+          <w:noProof/>
           <w:lang w:val="en-US"/>
         </w:rPr>
         <w:drawing>
@@ -5069,6 +4946,7 @@
         <w:rPr>
           <w:b/>
           <w:bCs/>
+          <w:noProof/>
           <w:lang w:val="en-US"/>
         </w:rPr>
         <w:drawing>
@@ -5138,6 +5016,7 @@
         <w:rPr>
           <w:b/>
           <w:bCs/>
+          <w:noProof/>
           <w:lang w:val="en-US"/>
         </w:rPr>
         <w:drawing>
@@ -5268,6 +5147,7 @@
         <w:rPr>
           <w:b/>
           <w:bCs/>
+          <w:noProof/>
           <w:lang w:val="en-US"/>
         </w:rPr>
         <w:drawing>
@@ -5295,6 +5175,75 @@
                     <a:xfrm>
                       <a:off x="0" y="0"/>
                       <a:ext cx="3866395" cy="2333600"/>
+                    </a:xfrm>
+                    <a:prstGeom prst="rect">
+                      <a:avLst/>
+                    </a:prstGeom>
+                  </pic:spPr>
+                </pic:pic>
+              </a:graphicData>
+            </a:graphic>
+          </wp:inline>
+        </w:drawing>
+      </w:r>
+    </w:p>
+    <w:p>
+      <w:pPr>
+        <w:rPr>
+          <w:b/>
+          <w:bCs/>
+          <w:lang w:val="en-US"/>
+        </w:rPr>
+      </w:pPr>
+      <w:r>
+        <w:rPr>
+          <w:b/>
+          <w:bCs/>
+          <w:lang w:val="en-US"/>
+        </w:rPr>
+        <w:lastRenderedPageBreak/>
+        <w:t>Pattern:</w:t>
+      </w:r>
+    </w:p>
+    <w:p>
+      <w:pPr>
+        <w:rPr>
+          <w:b/>
+          <w:bCs/>
+          <w:lang w:val="en-US"/>
+        </w:rPr>
+      </w:pPr>
+      <w:r>
+        <w:rPr>
+          <w:b/>
+          <w:bCs/>
+          <w:lang w:val="en-US"/>
+        </w:rPr>
+        <w:drawing>
+          <wp:inline distT="0" distB="0" distL="0" distR="0" wp14:anchorId="58F326A1" wp14:editId="0A523581">
+            <wp:extent cx="2450380" cy="3817620"/>
+            <wp:effectExtent l="0" t="0" r="7620" b="0"/>
+            <wp:docPr id="1492540377" name="Picture 1"/>
+            <wp:cNvGraphicFramePr>
+              <a:graphicFrameLocks xmlns:a="http://schemas.openxmlformats.org/drawingml/2006/main" noChangeAspect="1"/>
+            </wp:cNvGraphicFramePr>
+            <a:graphic xmlns:a="http://schemas.openxmlformats.org/drawingml/2006/main">
+              <a:graphicData uri="http://schemas.openxmlformats.org/drawingml/2006/picture">
+                <pic:pic xmlns:pic="http://schemas.openxmlformats.org/drawingml/2006/picture">
+                  <pic:nvPicPr>
+                    <pic:cNvPr id="1492540377" name=""/>
+                    <pic:cNvPicPr/>
+                  </pic:nvPicPr>
+                  <pic:blipFill>
+                    <a:blip r:embed="rId42"/>
+                    <a:stretch>
+                      <a:fillRect/>
+                    </a:stretch>
+                  </pic:blipFill>
+                  <pic:spPr>
+                    <a:xfrm>
+                      <a:off x="0" y="0"/>
+                      <a:ext cx="2465239" cy="3840770"/>
                     </a:xfrm>
                     <a:prstGeom prst="rect">
                       <a:avLst/>

</xml_diff>

<commit_message>
print an inverted half pyramid of numbers, enhancing output structure. Update DSA Notes to include a section for the new pattern.
</commit_message>
<xml_diff>
--- a/Notes/DSA Notes.docx
+++ b/Notes/DSA Notes.docx
@@ -5217,6 +5217,7 @@
         <w:rPr>
           <w:b/>
           <w:bCs/>
+          <w:noProof/>
           <w:lang w:val="en-US"/>
         </w:rPr>
         <w:drawing>
@@ -5244,6 +5245,74 @@
                     <a:xfrm>
                       <a:off x="0" y="0"/>
                       <a:ext cx="2465239" cy="3840770"/>
+                    </a:xfrm>
+                    <a:prstGeom prst="rect">
+                      <a:avLst/>
+                    </a:prstGeom>
+                  </pic:spPr>
+                </pic:pic>
+              </a:graphicData>
+            </a:graphic>
+          </wp:inline>
+        </w:drawing>
+      </w:r>
+    </w:p>
+    <w:p>
+      <w:pPr>
+        <w:rPr>
+          <w:b/>
+          <w:bCs/>
+          <w:lang w:val="en-US"/>
+        </w:rPr>
+      </w:pPr>
+      <w:r>
+        <w:rPr>
+          <w:b/>
+          <w:bCs/>
+          <w:lang w:val="en-US"/>
+        </w:rPr>
+        <w:t>Inverted Half pirymid:</w:t>
+      </w:r>
+    </w:p>
+    <w:p>
+      <w:pPr>
+        <w:rPr>
+          <w:b/>
+          <w:bCs/>
+          <w:lang w:val="en-US"/>
+        </w:rPr>
+      </w:pPr>
+      <w:r>
+        <w:rPr>
+          <w:b/>
+          <w:bCs/>
+          <w:lang w:val="en-US"/>
+        </w:rPr>
+        <w:drawing>
+          <wp:inline distT="0" distB="0" distL="0" distR="0" wp14:anchorId="1F34EEFA" wp14:editId="068111BB">
+            <wp:extent cx="4823460" cy="2282941"/>
+            <wp:effectExtent l="0" t="0" r="0" b="3175"/>
+            <wp:docPr id="1628053052" name="Picture 1"/>
+            <wp:cNvGraphicFramePr>
+              <a:graphicFrameLocks xmlns:a="http://schemas.openxmlformats.org/drawingml/2006/main" noChangeAspect="1"/>
+            </wp:cNvGraphicFramePr>
+            <a:graphic xmlns:a="http://schemas.openxmlformats.org/drawingml/2006/main">
+              <a:graphicData uri="http://schemas.openxmlformats.org/drawingml/2006/picture">
+                <pic:pic xmlns:pic="http://schemas.openxmlformats.org/drawingml/2006/picture">
+                  <pic:nvPicPr>
+                    <pic:cNvPr id="1628053052" name=""/>
+                    <pic:cNvPicPr/>
+                  </pic:nvPicPr>
+                  <pic:blipFill>
+                    <a:blip r:embed="rId43"/>
+                    <a:stretch>
+                      <a:fillRect/>
+                    </a:stretch>
+                  </pic:blipFill>
+                  <pic:spPr>
+                    <a:xfrm>
+                      <a:off x="0" y="0"/>
+                      <a:ext cx="4859310" cy="2299909"/>
                     </a:xfrm>
                     <a:prstGeom prst="rect">
                       <a:avLst/>

</xml_diff>

<commit_message>
Implement Floyd's Triangle pattern in JavaBasics.java and update DSA Notes to include a section for the new pattern.
</commit_message>
<xml_diff>
--- a/Notes/DSA Notes.docx
+++ b/Notes/DSA Notes.docx
@@ -281,17 +281,41 @@
     </w:p>
     <w:p>
       <w:r>
-        <w:t xml:space="preserve">  Add(tea leaves)  </w:t>
-      </w:r>
-    </w:p>
-    <w:p>
-      <w:r>
-        <w:t xml:space="preserve">  Add(sugar, milk)  </w:t>
-      </w:r>
-    </w:p>
-    <w:p>
-      <w:r>
-        <w:t xml:space="preserve">  Boil(2 minutes)  </w:t>
+        <w:t xml:space="preserve">  </w:t>
+      </w:r>
+      <w:proofErr w:type="gramStart"/>
+      <w:r>
+        <w:t>Add(</w:t>
+      </w:r>
+      <w:proofErr w:type="gramEnd"/>
+      <w:r>
+        <w:t xml:space="preserve">tea leaves)  </w:t>
+      </w:r>
+    </w:p>
+    <w:p>
+      <w:r>
+        <w:t xml:space="preserve">  </w:t>
+      </w:r>
+      <w:proofErr w:type="gramStart"/>
+      <w:r>
+        <w:t>Add(</w:t>
+      </w:r>
+      <w:proofErr w:type="gramEnd"/>
+      <w:r>
+        <w:t xml:space="preserve">sugar, milk)  </w:t>
+      </w:r>
+    </w:p>
+    <w:p>
+      <w:r>
+        <w:t xml:space="preserve">  </w:t>
+      </w:r>
+      <w:proofErr w:type="gramStart"/>
+      <w:r>
+        <w:t>Boil(</w:t>
+      </w:r>
+      <w:proofErr w:type="gramEnd"/>
+      <w:r>
+        <w:t xml:space="preserve">2 minutes)  </w:t>
       </w:r>
     </w:p>
     <w:p>
@@ -1134,8 +1158,13 @@
             <w:hideMark/>
           </w:tcPr>
           <w:p>
-            <w:r>
-              <w:t>a != b</w:t>
+            <w:proofErr w:type="gramStart"/>
+            <w:r>
+              <w:t>a !</w:t>
+            </w:r>
+            <w:proofErr w:type="gramEnd"/>
+            <w:r>
+              <w:t>= b</w:t>
             </w:r>
           </w:p>
         </w:tc>
@@ -1562,8 +1591,13 @@
             <w:r>
               <w:t xml:space="preserve">     </w:t>
             </w:r>
-            <w:r>
-              <w:t>!(a &gt; b)</w:t>
+            <w:proofErr w:type="gramStart"/>
+            <w:r>
+              <w:t>!(</w:t>
+            </w:r>
+            <w:proofErr w:type="gramEnd"/>
+            <w:r>
+              <w:t>a &gt; b)</w:t>
             </w:r>
           </w:p>
         </w:tc>
@@ -2253,9 +2287,11 @@
             <w:hideMark/>
           </w:tcPr>
           <w:p>
+            <w:proofErr w:type="gramStart"/>
             <w:r>
               <w:t>!true</w:t>
             </w:r>
+            <w:proofErr w:type="gramEnd"/>
           </w:p>
         </w:tc>
       </w:tr>
@@ -2821,7 +2857,23 @@
           </w:tcPr>
           <w:p>
             <w:r>
-              <w:t>a &gt; b ? a : b</w:t>
+              <w:t xml:space="preserve">a &gt; </w:t>
+            </w:r>
+            <w:proofErr w:type="gramStart"/>
+            <w:r>
+              <w:t>b ?</w:t>
+            </w:r>
+            <w:proofErr w:type="gramEnd"/>
+            <w:r>
+              <w:t xml:space="preserve"> </w:t>
+            </w:r>
+            <w:proofErr w:type="gramStart"/>
+            <w:r>
+              <w:t>a :</w:t>
+            </w:r>
+            <w:proofErr w:type="gramEnd"/>
+            <w:r>
+              <w:t xml:space="preserve"> b</w:t>
             </w:r>
           </w:p>
         </w:tc>
@@ -2848,7 +2900,23 @@
           <w:b/>
           <w:bCs/>
         </w:rPr>
-        <w:t xml:space="preserve"> 8. instanceof Operator</w:t>
+        <w:t xml:space="preserve"> 8. </w:t>
+      </w:r>
+      <w:proofErr w:type="spellStart"/>
+      <w:r>
+        <w:rPr>
+          <w:b/>
+          <w:bCs/>
+        </w:rPr>
+        <w:t>instanceof</w:t>
+      </w:r>
+      <w:proofErr w:type="spellEnd"/>
+      <w:r>
+        <w:rPr>
+          <w:b/>
+          <w:bCs/>
+        </w:rPr>
+        <w:t xml:space="preserve"> Operator</w:t>
       </w:r>
     </w:p>
     <w:p>
@@ -2956,9 +3024,11 @@
             <w:hideMark/>
           </w:tcPr>
           <w:p>
+            <w:proofErr w:type="spellStart"/>
             <w:r>
               <w:t>instanceof</w:t>
             </w:r>
+            <w:proofErr w:type="spellEnd"/>
           </w:p>
         </w:tc>
         <w:tc>
@@ -2980,8 +3050,21 @@
             <w:hideMark/>
           </w:tcPr>
           <w:p>
-            <w:r>
-              <w:t>obj instanceof String</w:t>
+            <w:proofErr w:type="spellStart"/>
+            <w:r>
+              <w:t>obj</w:t>
+            </w:r>
+            <w:proofErr w:type="spellEnd"/>
+            <w:r>
+              <w:t xml:space="preserve"> </w:t>
+            </w:r>
+            <w:proofErr w:type="spellStart"/>
+            <w:r>
+              <w:t>instanceof</w:t>
+            </w:r>
+            <w:proofErr w:type="spellEnd"/>
+            <w:r>
+              <w:t xml:space="preserve"> String</w:t>
             </w:r>
           </w:p>
         </w:tc>
@@ -4088,17 +4171,49 @@
           <w:b/>
           <w:bCs/>
         </w:rPr>
-        <w:t>Q. Function Overloading</w:t>
-      </w:r>
-      <w:r>
-        <w:rPr>
-          <w:b/>
-          <w:bCs/>
-        </w:rPr>
-        <w:t xml:space="preserve"> : </w:t>
-      </w:r>
-      <w:r>
-        <w:t>It depend on parameter , not return type</w:t>
+        <w:t xml:space="preserve">Q. Function </w:t>
+      </w:r>
+      <w:proofErr w:type="gramStart"/>
+      <w:r>
+        <w:rPr>
+          <w:b/>
+          <w:bCs/>
+        </w:rPr>
+        <w:t>Overloading</w:t>
+      </w:r>
+      <w:r>
+        <w:rPr>
+          <w:b/>
+          <w:bCs/>
+        </w:rPr>
+        <w:t xml:space="preserve"> :</w:t>
+      </w:r>
+      <w:proofErr w:type="gramEnd"/>
+      <w:r>
+        <w:rPr>
+          <w:b/>
+          <w:bCs/>
+        </w:rPr>
+        <w:t xml:space="preserve"> </w:t>
+      </w:r>
+      <w:r>
+        <w:t xml:space="preserve">It </w:t>
+      </w:r>
+      <w:proofErr w:type="gramStart"/>
+      <w:r>
+        <w:t>depend</w:t>
+      </w:r>
+      <w:proofErr w:type="gramEnd"/>
+      <w:r>
+        <w:t xml:space="preserve"> on </w:t>
+      </w:r>
+      <w:proofErr w:type="gramStart"/>
+      <w:r>
+        <w:t>parameter ,</w:t>
+      </w:r>
+      <w:proofErr w:type="gramEnd"/>
+      <w:r>
+        <w:t xml:space="preserve"> not return type</w:t>
       </w:r>
     </w:p>
     <w:p>
@@ -4163,7 +4278,23 @@
           <w:b/>
           <w:bCs/>
         </w:rPr>
-        <w:t>Using parameter’s:</w:t>
+        <w:t xml:space="preserve">Using </w:t>
+      </w:r>
+      <w:proofErr w:type="gramStart"/>
+      <w:r>
+        <w:rPr>
+          <w:b/>
+          <w:bCs/>
+        </w:rPr>
+        <w:t>parameter’s</w:t>
+      </w:r>
+      <w:proofErr w:type="gramEnd"/>
+      <w:r>
+        <w:rPr>
+          <w:b/>
+          <w:bCs/>
+        </w:rPr>
+        <w:t>:</w:t>
       </w:r>
     </w:p>
     <w:p>
@@ -4334,7 +4465,25 @@
           <w:bCs/>
           <w:lang w:val="en-US"/>
         </w:rPr>
-        <w:t>Using datatypes:</w:t>
+        <w:t xml:space="preserve">Using </w:t>
+      </w:r>
+      <w:proofErr w:type="gramStart"/>
+      <w:r>
+        <w:rPr>
+          <w:b/>
+          <w:bCs/>
+          <w:lang w:val="en-US"/>
+        </w:rPr>
+        <w:t>datatypes</w:t>
+      </w:r>
+      <w:proofErr w:type="gramEnd"/>
+      <w:r>
+        <w:rPr>
+          <w:b/>
+          <w:bCs/>
+          <w:lang w:val="en-US"/>
+        </w:rPr>
+        <w:t>:</w:t>
       </w:r>
     </w:p>
     <w:p>
@@ -5271,27 +5420,45 @@
           <w:bCs/>
           <w:lang w:val="en-US"/>
         </w:rPr>
-        <w:t>Inverted Half pirymid:</w:t>
-      </w:r>
-    </w:p>
-    <w:p>
-      <w:pPr>
+        <w:t xml:space="preserve">Inverted Half </w:t>
+      </w:r>
+      <w:proofErr w:type="spellStart"/>
+      <w:r>
         <w:rPr>
           <w:b/>
           <w:bCs/>
           <w:lang w:val="en-US"/>
         </w:rPr>
-      </w:pPr>
+        <w:t>pirymid</w:t>
+      </w:r>
+      <w:proofErr w:type="spellEnd"/>
       <w:r>
         <w:rPr>
           <w:b/>
           <w:bCs/>
           <w:lang w:val="en-US"/>
         </w:rPr>
+        <w:t>:</w:t>
+      </w:r>
+    </w:p>
+    <w:p>
+      <w:pPr>
+        <w:rPr>
+          <w:b/>
+          <w:bCs/>
+          <w:lang w:val="en-US"/>
+        </w:rPr>
+      </w:pPr>
+      <w:r>
+        <w:rPr>
+          <w:b/>
+          <w:bCs/>
+          <w:lang w:val="en-US"/>
+        </w:rPr>
         <w:drawing>
-          <wp:inline distT="0" distB="0" distL="0" distR="0" wp14:anchorId="1F34EEFA" wp14:editId="068111BB">
-            <wp:extent cx="4823460" cy="2282941"/>
-            <wp:effectExtent l="0" t="0" r="0" b="3175"/>
+          <wp:inline distT="0" distB="0" distL="0" distR="0" wp14:anchorId="1F34EEFA" wp14:editId="614E438A">
+            <wp:extent cx="4282531" cy="2026920"/>
+            <wp:effectExtent l="0" t="0" r="3810" b="0"/>
             <wp:docPr id="1628053052" name="Picture 1"/>
             <wp:cNvGraphicFramePr>
               <a:graphicFrameLocks xmlns:a="http://schemas.openxmlformats.org/drawingml/2006/main" noChangeAspect="1"/>
@@ -5312,7 +5479,83 @@
                   <pic:spPr>
                     <a:xfrm>
                       <a:off x="0" y="0"/>
-                      <a:ext cx="4859310" cy="2299909"/>
+                      <a:ext cx="4334712" cy="2051617"/>
+                    </a:xfrm>
+                    <a:prstGeom prst="rect">
+                      <a:avLst/>
+                    </a:prstGeom>
+                  </pic:spPr>
+                </pic:pic>
+              </a:graphicData>
+            </a:graphic>
+          </wp:inline>
+        </w:drawing>
+      </w:r>
+    </w:p>
+    <w:p>
+      <w:pPr>
+        <w:rPr>
+          <w:b/>
+          <w:bCs/>
+          <w:lang w:val="en-US"/>
+        </w:rPr>
+      </w:pPr>
+      <w:r>
+        <w:rPr>
+          <w:b/>
+          <w:bCs/>
+          <w:lang w:val="en-US"/>
+        </w:rPr>
+        <w:t>Floyd's Triangle Pattern</w:t>
+      </w:r>
+      <w:r>
+        <w:rPr>
+          <w:b/>
+          <w:bCs/>
+          <w:lang w:val="en-US"/>
+        </w:rPr>
+        <w:t>:</w:t>
+      </w:r>
+    </w:p>
+    <w:p>
+      <w:pPr>
+        <w:rPr>
+          <w:b/>
+          <w:bCs/>
+          <w:lang w:val="en-US"/>
+        </w:rPr>
+      </w:pPr>
+      <w:r>
+        <w:rPr>
+          <w:b/>
+          <w:bCs/>
+          <w:lang w:val="en-US"/>
+        </w:rPr>
+        <w:drawing>
+          <wp:inline distT="0" distB="0" distL="0" distR="0" wp14:anchorId="0ED0FC5C" wp14:editId="409FD11B">
+            <wp:extent cx="4427220" cy="1920783"/>
+            <wp:effectExtent l="0" t="0" r="0" b="3810"/>
+            <wp:docPr id="333751007" name="Picture 1"/>
+            <wp:cNvGraphicFramePr>
+              <a:graphicFrameLocks xmlns:a="http://schemas.openxmlformats.org/drawingml/2006/main" noChangeAspect="1"/>
+            </wp:cNvGraphicFramePr>
+            <a:graphic xmlns:a="http://schemas.openxmlformats.org/drawingml/2006/main">
+              <a:graphicData uri="http://schemas.openxmlformats.org/drawingml/2006/picture">
+                <pic:pic xmlns:pic="http://schemas.openxmlformats.org/drawingml/2006/picture">
+                  <pic:nvPicPr>
+                    <pic:cNvPr id="333751007" name=""/>
+                    <pic:cNvPicPr/>
+                  </pic:nvPicPr>
+                  <pic:blipFill>
+                    <a:blip r:embed="rId44"/>
+                    <a:stretch>
+                      <a:fillRect/>
+                    </a:stretch>
+                  </pic:blipFill>
+                  <pic:spPr>
+                    <a:xfrm>
+                      <a:off x="0" y="0"/>
+                      <a:ext cx="4501491" cy="1953006"/>
                     </a:xfrm>
                     <a:prstGeom prst="rect">
                       <a:avLst/>

</xml_diff>

<commit_message>
implement a 0-1 triangle pattern and update DSA Notes to include a section for the new pattern.
</commit_message>
<xml_diff>
--- a/Notes/DSA Notes.docx
+++ b/Notes/DSA Notes.docx
@@ -281,41 +281,17 @@
     </w:p>
     <w:p>
       <w:r>
-        <w:t xml:space="preserve">  </w:t>
-      </w:r>
-      <w:proofErr w:type="gramStart"/>
-      <w:r>
-        <w:t>Add(</w:t>
-      </w:r>
-      <w:proofErr w:type="gramEnd"/>
-      <w:r>
-        <w:t xml:space="preserve">tea leaves)  </w:t>
-      </w:r>
-    </w:p>
-    <w:p>
-      <w:r>
-        <w:t xml:space="preserve">  </w:t>
-      </w:r>
-      <w:proofErr w:type="gramStart"/>
-      <w:r>
-        <w:t>Add(</w:t>
-      </w:r>
-      <w:proofErr w:type="gramEnd"/>
-      <w:r>
-        <w:t xml:space="preserve">sugar, milk)  </w:t>
-      </w:r>
-    </w:p>
-    <w:p>
-      <w:r>
-        <w:t xml:space="preserve">  </w:t>
-      </w:r>
-      <w:proofErr w:type="gramStart"/>
-      <w:r>
-        <w:t>Boil(</w:t>
-      </w:r>
-      <w:proofErr w:type="gramEnd"/>
-      <w:r>
-        <w:t xml:space="preserve">2 minutes)  </w:t>
+        <w:t xml:space="preserve">  Add(tea leaves)  </w:t>
+      </w:r>
+    </w:p>
+    <w:p>
+      <w:r>
+        <w:t xml:space="preserve">  Add(sugar, milk)  </w:t>
+      </w:r>
+    </w:p>
+    <w:p>
+      <w:r>
+        <w:t xml:space="preserve">  Boil(2 minutes)  </w:t>
       </w:r>
     </w:p>
     <w:p>
@@ -1158,13 +1134,8 @@
             <w:hideMark/>
           </w:tcPr>
           <w:p>
-            <w:proofErr w:type="gramStart"/>
-            <w:r>
-              <w:t>a !</w:t>
-            </w:r>
-            <w:proofErr w:type="gramEnd"/>
-            <w:r>
-              <w:t>= b</w:t>
+            <w:r>
+              <w:t>a != b</w:t>
             </w:r>
           </w:p>
         </w:tc>
@@ -1591,13 +1562,8 @@
             <w:r>
               <w:t xml:space="preserve">     </w:t>
             </w:r>
-            <w:proofErr w:type="gramStart"/>
-            <w:r>
-              <w:t>!(</w:t>
-            </w:r>
-            <w:proofErr w:type="gramEnd"/>
-            <w:r>
-              <w:t>a &gt; b)</w:t>
+            <w:r>
+              <w:t>!(a &gt; b)</w:t>
             </w:r>
           </w:p>
         </w:tc>
@@ -2287,11 +2253,9 @@
             <w:hideMark/>
           </w:tcPr>
           <w:p>
-            <w:proofErr w:type="gramStart"/>
             <w:r>
               <w:t>!true</w:t>
             </w:r>
-            <w:proofErr w:type="gramEnd"/>
           </w:p>
         </w:tc>
       </w:tr>
@@ -2857,23 +2821,7 @@
           </w:tcPr>
           <w:p>
             <w:r>
-              <w:t xml:space="preserve">a &gt; </w:t>
-            </w:r>
-            <w:proofErr w:type="gramStart"/>
-            <w:r>
-              <w:t>b ?</w:t>
-            </w:r>
-            <w:proofErr w:type="gramEnd"/>
-            <w:r>
-              <w:t xml:space="preserve"> </w:t>
-            </w:r>
-            <w:proofErr w:type="gramStart"/>
-            <w:r>
-              <w:t>a :</w:t>
-            </w:r>
-            <w:proofErr w:type="gramEnd"/>
-            <w:r>
-              <w:t xml:space="preserve"> b</w:t>
+              <w:t>a &gt; b ? a : b</w:t>
             </w:r>
           </w:p>
         </w:tc>
@@ -4171,49 +4119,17 @@
           <w:b/>
           <w:bCs/>
         </w:rPr>
-        <w:t xml:space="preserve">Q. Function </w:t>
-      </w:r>
-      <w:proofErr w:type="gramStart"/>
-      <w:r>
-        <w:rPr>
-          <w:b/>
-          <w:bCs/>
-        </w:rPr>
-        <w:t>Overloading</w:t>
-      </w:r>
-      <w:r>
-        <w:rPr>
-          <w:b/>
-          <w:bCs/>
-        </w:rPr>
-        <w:t xml:space="preserve"> :</w:t>
-      </w:r>
-      <w:proofErr w:type="gramEnd"/>
-      <w:r>
-        <w:rPr>
-          <w:b/>
-          <w:bCs/>
-        </w:rPr>
-        <w:t xml:space="preserve"> </w:t>
-      </w:r>
-      <w:r>
-        <w:t xml:space="preserve">It </w:t>
-      </w:r>
-      <w:proofErr w:type="gramStart"/>
-      <w:r>
-        <w:t>depend</w:t>
-      </w:r>
-      <w:proofErr w:type="gramEnd"/>
-      <w:r>
-        <w:t xml:space="preserve"> on </w:t>
-      </w:r>
-      <w:proofErr w:type="gramStart"/>
-      <w:r>
-        <w:t>parameter ,</w:t>
-      </w:r>
-      <w:proofErr w:type="gramEnd"/>
-      <w:r>
-        <w:t xml:space="preserve"> not return type</w:t>
+        <w:t>Q. Function Overloading</w:t>
+      </w:r>
+      <w:r>
+        <w:rPr>
+          <w:b/>
+          <w:bCs/>
+        </w:rPr>
+        <w:t xml:space="preserve"> : </w:t>
+      </w:r>
+      <w:r>
+        <w:t>It depend on parameter , not return type</w:t>
       </w:r>
     </w:p>
     <w:p>
@@ -4278,23 +4194,7 @@
           <w:b/>
           <w:bCs/>
         </w:rPr>
-        <w:t xml:space="preserve">Using </w:t>
-      </w:r>
-      <w:proofErr w:type="gramStart"/>
-      <w:r>
-        <w:rPr>
-          <w:b/>
-          <w:bCs/>
-        </w:rPr>
-        <w:t>parameter’s</w:t>
-      </w:r>
-      <w:proofErr w:type="gramEnd"/>
-      <w:r>
-        <w:rPr>
-          <w:b/>
-          <w:bCs/>
-        </w:rPr>
-        <w:t>:</w:t>
+        <w:t>Using parameter’s:</w:t>
       </w:r>
     </w:p>
     <w:p>
@@ -4465,25 +4365,7 @@
           <w:bCs/>
           <w:lang w:val="en-US"/>
         </w:rPr>
-        <w:t xml:space="preserve">Using </w:t>
-      </w:r>
-      <w:proofErr w:type="gramStart"/>
-      <w:r>
-        <w:rPr>
-          <w:b/>
-          <w:bCs/>
-          <w:lang w:val="en-US"/>
-        </w:rPr>
-        <w:t>datatypes</w:t>
-      </w:r>
-      <w:proofErr w:type="gramEnd"/>
-      <w:r>
-        <w:rPr>
-          <w:b/>
-          <w:bCs/>
-          <w:lang w:val="en-US"/>
-        </w:rPr>
-        <w:t>:</w:t>
+        <w:t>Using datatypes:</w:t>
       </w:r>
     </w:p>
     <w:p>
@@ -5556,6 +5438,83 @@
                     <a:xfrm>
                       <a:off x="0" y="0"/>
                       <a:ext cx="4501491" cy="1953006"/>
+                    </a:xfrm>
+                    <a:prstGeom prst="rect">
+                      <a:avLst/>
+                    </a:prstGeom>
+                  </pic:spPr>
+                </pic:pic>
+              </a:graphicData>
+            </a:graphic>
+          </wp:inline>
+        </w:drawing>
+      </w:r>
+    </w:p>
+    <w:p>
+      <w:pPr>
+        <w:rPr>
+          <w:b/>
+          <w:bCs/>
+          <w:lang w:val="en-US"/>
+        </w:rPr>
+      </w:pPr>
+      <w:r>
+        <w:rPr>
+          <w:b/>
+          <w:bCs/>
+          <w:lang w:val="en-US"/>
+        </w:rPr>
+        <w:lastRenderedPageBreak/>
+        <w:t>0-1 Triangle Pattern</w:t>
+      </w:r>
+      <w:r>
+        <w:rPr>
+          <w:b/>
+          <w:bCs/>
+          <w:lang w:val="en-US"/>
+        </w:rPr>
+        <w:t>:</w:t>
+      </w:r>
+    </w:p>
+    <w:p>
+      <w:pPr>
+        <w:rPr>
+          <w:b/>
+          <w:bCs/>
+          <w:lang w:val="en-US"/>
+        </w:rPr>
+      </w:pPr>
+      <w:r>
+        <w:rPr>
+          <w:b/>
+          <w:bCs/>
+          <w:lang w:val="en-US"/>
+        </w:rPr>
+        <w:drawing>
+          <wp:inline distT="0" distB="0" distL="0" distR="0" wp14:anchorId="01103B29" wp14:editId="3506566B">
+            <wp:extent cx="4621710" cy="2186940"/>
+            <wp:effectExtent l="0" t="0" r="7620" b="3810"/>
+            <wp:docPr id="1942335332" name="Picture 1"/>
+            <wp:cNvGraphicFramePr>
+              <a:graphicFrameLocks xmlns:a="http://schemas.openxmlformats.org/drawingml/2006/main" noChangeAspect="1"/>
+            </wp:cNvGraphicFramePr>
+            <a:graphic xmlns:a="http://schemas.openxmlformats.org/drawingml/2006/main">
+              <a:graphicData uri="http://schemas.openxmlformats.org/drawingml/2006/picture">
+                <pic:pic xmlns:pic="http://schemas.openxmlformats.org/drawingml/2006/picture">
+                  <pic:nvPicPr>
+                    <pic:cNvPr id="1942335332" name=""/>
+                    <pic:cNvPicPr/>
+                  </pic:nvPicPr>
+                  <pic:blipFill>
+                    <a:blip r:embed="rId45"/>
+                    <a:stretch>
+                      <a:fillRect/>
+                    </a:stretch>
+                  </pic:blipFill>
+                  <pic:spPr>
+                    <a:xfrm>
+                      <a:off x="0" y="0"/>
+                      <a:ext cx="4635625" cy="2193524"/>
                     </a:xfrm>
                     <a:prstGeom prst="rect">
                       <a:avLst/>

</xml_diff>

<commit_message>
Add diamond pattern section to DSA Notes
</commit_message>
<xml_diff>
--- a/Notes/DSA Notes.docx
+++ b/Notes/DSA Notes.docx
@@ -2848,23 +2848,7 @@
           <w:b/>
           <w:bCs/>
         </w:rPr>
-        <w:t xml:space="preserve"> 8. </w:t>
-      </w:r>
-      <w:proofErr w:type="spellStart"/>
-      <w:r>
-        <w:rPr>
-          <w:b/>
-          <w:bCs/>
-        </w:rPr>
-        <w:t>instanceof</w:t>
-      </w:r>
-      <w:proofErr w:type="spellEnd"/>
-      <w:r>
-        <w:rPr>
-          <w:b/>
-          <w:bCs/>
-        </w:rPr>
-        <w:t xml:space="preserve"> Operator</w:t>
+        <w:t xml:space="preserve"> 8. instanceof Operator</w:t>
       </w:r>
     </w:p>
     <w:p>
@@ -2972,11 +2956,9 @@
             <w:hideMark/>
           </w:tcPr>
           <w:p>
-            <w:proofErr w:type="spellStart"/>
             <w:r>
               <w:t>instanceof</w:t>
             </w:r>
-            <w:proofErr w:type="spellEnd"/>
           </w:p>
         </w:tc>
         <w:tc>
@@ -2998,21 +2980,8 @@
             <w:hideMark/>
           </w:tcPr>
           <w:p>
-            <w:proofErr w:type="spellStart"/>
-            <w:r>
-              <w:t>obj</w:t>
-            </w:r>
-            <w:proofErr w:type="spellEnd"/>
-            <w:r>
-              <w:t xml:space="preserve"> </w:t>
-            </w:r>
-            <w:proofErr w:type="spellStart"/>
-            <w:r>
-              <w:t>instanceof</w:t>
-            </w:r>
-            <w:proofErr w:type="spellEnd"/>
-            <w:r>
-              <w:t xml:space="preserve"> String</w:t>
+            <w:r>
+              <w:t>obj instanceof String</w:t>
             </w:r>
           </w:p>
         </w:tc>
@@ -5302,39 +5271,22 @@
           <w:bCs/>
           <w:lang w:val="en-US"/>
         </w:rPr>
-        <w:t xml:space="preserve">Inverted Half </w:t>
-      </w:r>
-      <w:proofErr w:type="spellStart"/>
-      <w:r>
+        <w:t>Inverted Half pirymid:</w:t>
+      </w:r>
+    </w:p>
+    <w:p>
+      <w:pPr>
         <w:rPr>
           <w:b/>
           <w:bCs/>
           <w:lang w:val="en-US"/>
         </w:rPr>
-        <w:t>pirymid</w:t>
-      </w:r>
-      <w:proofErr w:type="spellEnd"/>
-      <w:r>
-        <w:rPr>
-          <w:b/>
-          <w:bCs/>
-          <w:lang w:val="en-US"/>
-        </w:rPr>
-        <w:t>:</w:t>
-      </w:r>
-    </w:p>
-    <w:p>
-      <w:pPr>
-        <w:rPr>
-          <w:b/>
-          <w:bCs/>
-          <w:lang w:val="en-US"/>
-        </w:rPr>
-      </w:pPr>
-      <w:r>
-        <w:rPr>
-          <w:b/>
-          <w:bCs/>
+      </w:pPr>
+      <w:r>
+        <w:rPr>
+          <w:b/>
+          <w:bCs/>
+          <w:noProof/>
           <w:lang w:val="en-US"/>
         </w:rPr>
         <w:drawing>
@@ -5411,6 +5363,7 @@
         <w:rPr>
           <w:b/>
           <w:bCs/>
+          <w:noProof/>
           <w:lang w:val="en-US"/>
         </w:rPr>
         <w:drawing>
@@ -5488,6 +5441,7 @@
         <w:rPr>
           <w:b/>
           <w:bCs/>
+          <w:noProof/>
           <w:lang w:val="en-US"/>
         </w:rPr>
         <w:drawing>
@@ -5515,6 +5469,74 @@
                     <a:xfrm>
                       <a:off x="0" y="0"/>
                       <a:ext cx="4635625" cy="2193524"/>
+                    </a:xfrm>
+                    <a:prstGeom prst="rect">
+                      <a:avLst/>
+                    </a:prstGeom>
+                  </pic:spPr>
+                </pic:pic>
+              </a:graphicData>
+            </a:graphic>
+          </wp:inline>
+        </w:drawing>
+      </w:r>
+    </w:p>
+    <w:p>
+      <w:pPr>
+        <w:rPr>
+          <w:b/>
+          <w:bCs/>
+          <w:lang w:val="en-US"/>
+        </w:rPr>
+      </w:pPr>
+      <w:r>
+        <w:rPr>
+          <w:b/>
+          <w:bCs/>
+          <w:lang w:val="en-US"/>
+        </w:rPr>
+        <w:t>Dimond Pattern:</w:t>
+      </w:r>
+    </w:p>
+    <w:p>
+      <w:pPr>
+        <w:rPr>
+          <w:b/>
+          <w:bCs/>
+          <w:lang w:val="en-US"/>
+        </w:rPr>
+      </w:pPr>
+      <w:r>
+        <w:rPr>
+          <w:b/>
+          <w:bCs/>
+          <w:lang w:val="en-US"/>
+        </w:rPr>
+        <w:drawing>
+          <wp:inline distT="0" distB="0" distL="0" distR="0" wp14:anchorId="7590941F" wp14:editId="257A62FF">
+            <wp:extent cx="5075933" cy="2522220"/>
+            <wp:effectExtent l="0" t="0" r="0" b="0"/>
+            <wp:docPr id="217147424" name="Picture 1"/>
+            <wp:cNvGraphicFramePr>
+              <a:graphicFrameLocks xmlns:a="http://schemas.openxmlformats.org/drawingml/2006/main" noChangeAspect="1"/>
+            </wp:cNvGraphicFramePr>
+            <a:graphic xmlns:a="http://schemas.openxmlformats.org/drawingml/2006/main">
+              <a:graphicData uri="http://schemas.openxmlformats.org/drawingml/2006/picture">
+                <pic:pic xmlns:pic="http://schemas.openxmlformats.org/drawingml/2006/picture">
+                  <pic:nvPicPr>
+                    <pic:cNvPr id="217147424" name=""/>
+                    <pic:cNvPicPr/>
+                  </pic:nvPicPr>
+                  <pic:blipFill>
+                    <a:blip r:embed="rId46"/>
+                    <a:stretch>
+                      <a:fillRect/>
+                    </a:stretch>
+                  </pic:blipFill>
+                  <pic:spPr>
+                    <a:xfrm>
+                      <a:off x="0" y="0"/>
+                      <a:ext cx="5082773" cy="2525619"/>
                     </a:xfrm>
                     <a:prstGeom prst="rect">
                       <a:avLst/>

</xml_diff>